<commit_message>
Mini-paper: H7 (sin EMA, orientación con producto punto y cruz), 3.ª evaluación en test, sección 5.7 de robustez
</commit_message>
<xml_diff>
--- a/docs/mini_paper/Mini_paper_PENGWIN.docx
+++ b/docs/mini_paper/Mini_paper_PENGWIN.docx
@@ -100,7 +100,7 @@
           <w:sz w:val="21"/>
           <w:szCs w:val="21"/>
         </w:rPr>
-        <w:t xml:space="preserve">Presentamos un sistema que, en cada corte axial de una tomografía de pelvis, indica qué regiones óseas aparecen (sacro, coxal izquierdo y coxal derecho), las localiza con cajas, segmenta sus fragmentos y mide en milímetros cuánto se separó cada fragmento del fragmento principal de su hueso. Es una sola red 2D de 2.74 millones de parámetros, con backbone convolucional propio, atención CBAM y tres cabezas entrenadas desde cero, sin frameworks de detección ni de segmentación. Se entrenó y se evaluó con los 100 volúmenes públicos de PENGWIN, divididos por paciente en 70, 15 y 15. Al analizar los fallos encontramos que 34 de los 100 volúmenes están guardados girados 180° en el plano. Enderezarlos a partir de la cabecera del archivo y entrenar con rotaciones de ±35° subió el Dice por fragmento en validación de 0.851 a 0.869. En test, el modelo final cumple los nueve objetivos del curso, con un Dice por fragmento de 0.875 (0.875, 0.875 y 0.876 con tres semillas). Esa cifra es una segunda evaluación en test, hecha después de analizar los fallos; la primera, con la configuración congelada antes de ver test, dio 0.845. La distancia de separación tiene un error medio de 1.28 mm. La parte más débil son los fragmentos secundarios, con Dice de 0.750.</w:t>
+        <w:t xml:space="preserve">Presentamos un sistema que, en cada corte axial de una tomografía de pelvis, indica qué regiones óseas aparecen (sacro, coxal izquierdo y coxal derecho), las localiza con cajas, segmenta sus fragmentos y mide en milímetros cuánto se separó cada fragmento del fragmento principal de su hueso. Es una sola red 2D de 2.74 millones de parámetros, con backbone convolucional propio, atención CBAM y tres cabezas entrenadas desde cero, sin frameworks de detección ni de segmentación. Se entrenó y se evaluó con los 100 volúmenes públicos de PENGWIN, divididos por paciente en 70, 15 y 15. Al analizar los fallos encontramos que 34 de los 100 volúmenes están guardados girados 180° en el plano; enderezarlos a partir de la cabecera y entrenar con rotaciones de ±35° subió el Dice por fragmento en validación de 0.851 a 0.869. Siguiendo las correcciones del profesor, la orientación se calcula con productos punto y cruz sobre los metadatos, la rotación de entrenamiento se hace en milímetros y el modelo final (H7) no usa promedio exponencial de los pesos. En test, H7 cumple los nueve objetivos del curso, con un Dice por fragmento de 0.879. Es la tercera evaluación en test: la primera, con la configuración congelada antes de ver test, dio 0.845, y la segunda (H6), hecha después de analizar los fallos, 0.875. Un enderezado del giro del paciente recupera casi todo el rendimiento con pacientes girados 60° (de 0.636 a 0.855), y suavizar la imagen recupera el ruido leve. La distancia de separación tiene un error medio de 1.28 mm. La parte más débil son los fragmentos secundarios, con Dice de 0.750.</w:t>
       </w:r>
     </w:p>
     <w:p>
@@ -183,7 +183,7 @@
           <w:sz w:val="21"/>
           <w:szCs w:val="21"/>
         </w:rPr>
-        <w:t xml:space="preserve">Los aportes son tres. Primero, una red ligera que resuelve clasificación, detección, segmentación por fragmento y medición en un solo paso. Segundo, el hallazgo de que un tercio del dataset está guardado en otra orientación, y la medida de cuánto afecta al modelo. Tercero, un protocolo de experimentos con el ruido medido entre semillas y con todas las consultas a test declaradas.</w:t>
+        <w:t xml:space="preserve">Los aportes son cuatro. Primero, una red ligera que resuelve clasificación, detección, segmentación por fragmento y medición en un solo paso. Segundo, el hallazgo de que un tercio del dataset está guardado en otra orientación, y la medida de cuánto afecta al modelo. Tercero, un protocolo de experimentos con el ruido medido entre semillas y con todas las consultas a test declaradas. Cuarto, la corrección de la orientación con los metadatos y una prueba de robustez a pacientes girados y a imágenes ruidosas.</w:t>
       </w:r>
     </w:p>
     <w:p>
@@ -251,7 +251,7 @@
           <w:sz w:val="21"/>
           <w:szCs w:val="21"/>
         </w:rPr>
-        <w:t xml:space="preserve">La cabecera de 34 de los 100 archivos indica que el volumen está guardado girado 180° en el plano axial (22 en entrenamiento, 10 en validación y 2 en test). En esos casos el sacro queda arriba y los coxales intercambian su lado en la imagen. El paso de orientación canónica lee la cabecera y endereza el volumen, igual en la imagen y en la máscara, en todos los conjuntos y sin usar las etiquetas.</w:t>
+        <w:t xml:space="preserve">La cabecera de 34 de los 100 archivos indica que el volumen está guardado girado 180° en el plano axial (22 en entrenamiento, 10 en validación y 2 en test). En esos casos el sacro queda arriba y los coxales intercambian su lado en la imagen. El paso de orientación canónica lee la cabecera y endereza el volumen, igual en la imagen y en la máscara, en todos los conjuntos y sin usar las etiquetas. La orientación se obtiene con productos punto y cruz sobre la matriz de dirección de la cabecera, como en el método de Ferro Sánchez et al. [7]: el producto punto indica con qué eje del paciente coincide cada eje de la imagen, y el producto cruz de filas y columnas, hacia dónde van los cortes y si la imagen está en espejo.</w:t>
       </w:r>
     </w:p>
     <w:p>
@@ -964,7 +964,7 @@
                 <w:sz w:val="18"/>
                 <w:szCs w:val="18"/>
               </w:rPr>
-              <w:t xml:space="preserve">Promedio exponencial de los pesos (EMA)</w:t>
+              <w:t xml:space="preserve">Promedio exponencial de los pesos (EMA), solo hasta H6</w:t>
             </w:r>
           </w:p>
         </w:tc>
@@ -997,7 +997,7 @@
                 <w:sz w:val="18"/>
                 <w:szCs w:val="18"/>
               </w:rPr>
-              <w:t xml:space="preserve">Estabiliza el final del entrenamiento</w:t>
+              <w:t xml:space="preserve">Estabiliza el final del entrenamiento. Se retiró en H7 por pedido del profesor: puede hacer al modelo frágil con imágenes de mala calidad</w:t>
             </w:r>
           </w:p>
         </w:tc>
@@ -1030,7 +1030,7 @@
                 <w:sz w:val="18"/>
                 <w:szCs w:val="18"/>
               </w:rPr>
-              <w:t xml:space="preserve">Secundarios +0.016, +0.048 y +0.009 en tres semillas</w:t>
+              <w:t xml:space="preserve">Secundarios +0.016, +0.048 y +0.009 en tres semillas (D5). Sin EMA, H7 da 0.873 frente a 0.869 de H6</w:t>
             </w:r>
           </w:p>
         </w:tc>
@@ -1956,7 +1956,7 @@
           <w:sz w:val="21"/>
           <w:szCs w:val="21"/>
         </w:rPr>
-        <w:t xml:space="preserve">El modelo se entrena desde cero con AdamW (tasa 2 × 10⁻³ con decaimiento coseno, lote de 16, precisión mixta), 60 épocas de 2 500 cortes y un promedio exponencial de los pesos (EMA, 0.999). El aumento de datos combina espejo sagital con intercambio de las etiquetas de los coxales, cambios de intensidad y, en el modelo final, rotación de hasta ±35°, escala, proporción y desplazamiento.</w:t>
+        <w:t xml:space="preserve">El modelo se entrena desde cero con AdamW (tasa 2 × 10⁻³ con decaimiento coseno, lote de 16, precisión mixta), 60 épocas de 2 500 cortes. H6 usaba un promedio exponencial de los pesos (EMA, 0.999); el modelo final, H7, no lo usa. El aumento de datos combina espejo sagital con intercambio de las etiquetas de los coxales, cambios de intensidad y, en el modelo final, rotación de hasta ±35° (en milímetros en H7), escala, proporción y desplazamiento.</w:t>
       </w:r>
     </w:p>
     <w:p>
@@ -2046,7 +2046,7 @@
           <w:sz w:val="21"/>
           <w:szCs w:val="21"/>
         </w:rPr>
-        <w:t xml:space="preserve">Test se evaluó dos veces con modelos distintos. La primera, con el modelo D5 y la configuración congelada antes de ver test, es la cifra limpia. La segunda, con el modelo final H6, se hizo después de estudiar por qué fallaban dos casos de test (012 y 039). H6 se eligió solo con validación y su configuración se fijó por escrito antes de evaluarlo, pero la decisión de investigar la orientación nació de mirar test, y por eso reportamos las dos cifras. Las demás consultas a test (otras semillas y variantes que no se adoptaron) están en la bitácora del repositorio.</w:t>
+        <w:t xml:space="preserve">Test se evaluó tres veces con modelos distintos. La primera, con el modelo D5 y la configuración congelada antes de ver test, es la cifra limpia. La segunda, con H6, se hizo después de estudiar por qué fallaban dos casos de test (012 y 039). H6 se eligió solo con validación y su configuración se fijó por escrito antes de evaluarlo, pero la decisión de investigar la orientación nació de mirar test, y por eso reportamos todas las cifras. La tercera, con H7, aplica las correcciones del profesor (sección 5.7) y también se eligió solo con validación. Contando dos variantes que no se adoptaron (receta c2 y EMA con CASR), test se consultó cinco veces; todas están en la bitácora del repositorio.</w:t>
       </w:r>
     </w:p>
     <w:p>
@@ -2094,7 +2094,7 @@
           <w:sz w:val="21"/>
           <w:szCs w:val="21"/>
         </w:rPr>
-        <w:t xml:space="preserve">El modelo final cumple los nueve objetivos en test (Tabla 3). La primera evaluación cumplía ocho: el Dice por fragmento quedaba en 0.845. Las tres semillas de H6 dan 0.875, 0.875 y 0.876; promediar los tres modelos da 0.879, pero triplica el costo y no se usa. La detección se reporta con la caja refinada con la máscara semántica; la cabeza de grid sola obtiene en test un IoU medio de 0.783, mAP50 de 0.912 y mAP50:95 de 0.556, que también cumplen.</w:t>
+        <w:t xml:space="preserve">El modelo final, H7, cumple los nueve objetivos en test (Tabla 3), igual que H6. La primera evaluación cumplía ocho: el Dice por fragmento quedaba en 0.845. Las tres semillas de H6 dan 0.875, 0.875 y 0.876; promediar los tres modelos da 0.879, pero triplica el costo y no se usa. La detección se reporta con la caja refinada con la máscara semántica; con H6, la cabeza de grid sola obtiene en test un IoU medio de 0.783, mAP50 de 0.912 y mAP50:95 de 0.556, que también cumplen. Los análisis de las secciones 5.4 a 6.2 se hicieron con H6, que comparte arquitectura con H7.</w:t>
       </w:r>
     </w:p>
     <w:p>
@@ -2109,7 +2109,7 @@
           <w:sz w:val="18"/>
           <w:szCs w:val="18"/>
         </w:rPr>
-        <w:t xml:space="preserve">Tabla 3. Las nueve métricas del curso. Test: 15 casos; un modelo con TTA.</w:t>
+        <w:t xml:space="preserve">Tabla 3. Las nueve métricas del curso. Test: 15 casos; un modelo con TTA. Validación: H7.</w:t>
       </w:r>
     </w:p>
     <w:tbl>
@@ -2126,11 +2126,12 @@
         </w:tblBorders>
       </w:tblPr>
       <w:tblGrid>
-        <w:gridCol w:w="3300"/>
-        <w:gridCol w:w="1100"/>
-        <w:gridCol w:w="1650"/>
-        <w:gridCol w:w="1650"/>
-        <w:gridCol w:w="1660"/>
+        <w:gridCol w:w="2700"/>
+        <w:gridCol w:w="900"/>
+        <w:gridCol w:w="1440"/>
+        <w:gridCol w:w="1440"/>
+        <w:gridCol w:w="1440"/>
+        <w:gridCol w:w="1440"/>
       </w:tblGrid>
       <w:tr>
         <w:trPr>
@@ -2139,7 +2140,7 @@
         </w:trPr>
         <w:tc>
           <w:tcPr>
-            <w:tcW w:type="dxa" w:w="3300"/>
+            <w:tcW w:type="dxa" w:w="2700"/>
             <w:tcBorders>
               <w:top w:val="single" w:color="000000" w:sz="10"/>
               <w:left w:val="none" w:color="FFFFFF" w:sz="0"/>
@@ -2172,7 +2173,7 @@
         </w:tc>
         <w:tc>
           <w:tcPr>
-            <w:tcW w:type="dxa" w:w="1100"/>
+            <w:tcW w:type="dxa" w:w="900"/>
             <w:tcBorders>
               <w:top w:val="single" w:color="000000" w:sz="10"/>
               <w:left w:val="none" w:color="FFFFFF" w:sz="0"/>
@@ -2205,7 +2206,7 @@
         </w:tc>
         <w:tc>
           <w:tcPr>
-            <w:tcW w:type="dxa" w:w="1650"/>
+            <w:tcW w:type="dxa" w:w="1440"/>
             <w:tcBorders>
               <w:top w:val="single" w:color="000000" w:sz="10"/>
               <w:left w:val="none" w:color="FFFFFF" w:sz="0"/>
@@ -2238,7 +2239,7 @@
         </w:tc>
         <w:tc>
           <w:tcPr>
-            <w:tcW w:type="dxa" w:w="1650"/>
+            <w:tcW w:type="dxa" w:w="1440"/>
             <w:tcBorders>
               <w:top w:val="single" w:color="000000" w:sz="10"/>
               <w:left w:val="none" w:color="FFFFFF" w:sz="0"/>
@@ -2271,7 +2272,7 @@
         </w:tc>
         <w:tc>
           <w:tcPr>
-            <w:tcW w:type="dxa" w:w="1660"/>
+            <w:tcW w:type="dxa" w:w="1440"/>
             <w:tcBorders>
               <w:top w:val="single" w:color="000000" w:sz="10"/>
               <w:left w:val="none" w:color="FFFFFF" w:sz="0"/>
@@ -2298,7 +2299,40 @@
                 <w:sz w:val="18"/>
                 <w:szCs w:val="18"/>
               </w:rPr>
-              <w:t xml:space="preserve">Validación (H6)</w:t>
+              <w:t xml:space="preserve">Test, 3.ª eval. (H7)</w:t>
+            </w:r>
+          </w:p>
+        </w:tc>
+        <w:tc>
+          <w:tcPr>
+            <w:tcW w:type="dxa" w:w="1440"/>
+            <w:tcBorders>
+              <w:top w:val="single" w:color="000000" w:sz="10"/>
+              <w:left w:val="none" w:color="FFFFFF" w:sz="0"/>
+              <w:bottom w:val="single" w:color="000000" w:sz="4"/>
+              <w:right w:val="none" w:color="FFFFFF" w:sz="0"/>
+            </w:tcBorders>
+            <w:tcMar>
+              <w:top w:type="dxa" w:w="35"/>
+              <w:left w:type="dxa" w:w="70"/>
+              <w:bottom w:type="dxa" w:w="35"/>
+              <w:right w:type="dxa" w:w="70"/>
+            </w:tcMar>
+          </w:tcPr>
+          <w:p>
+            <w:pPr>
+              <w:keepNext/>
+              <w:jc w:val="center"/>
+            </w:pPr>
+            <w:r>
+              <w:rPr>
+                <w:rFonts w:ascii="Times New Roman" w:cs="Times New Roman" w:eastAsia="Times New Roman" w:hAnsi="Times New Roman"/>
+                <w:b/>
+                <w:bCs/>
+                <w:sz w:val="18"/>
+                <w:szCs w:val="18"/>
+              </w:rPr>
+              <w:t xml:space="preserve">Validación (H7)</w:t>
             </w:r>
           </w:p>
         </w:tc>
@@ -2309,7 +2343,7 @@
         </w:trPr>
         <w:tc>
           <w:tcPr>
-            <w:tcW w:type="dxa" w:w="3300"/>
+            <w:tcW w:type="dxa" w:w="2700"/>
             <w:tcBorders>
               <w:top w:val="none" w:color="FFFFFF" w:sz="0"/>
               <w:left w:val="none" w:color="FFFFFF" w:sz="0"/>
@@ -2342,7 +2376,7 @@
         </w:tc>
         <w:tc>
           <w:tcPr>
-            <w:tcW w:type="dxa" w:w="1100"/>
+            <w:tcW w:type="dxa" w:w="900"/>
             <w:tcBorders>
               <w:top w:val="none" w:color="FFFFFF" w:sz="0"/>
               <w:left w:val="none" w:color="FFFFFF" w:sz="0"/>
@@ -2375,7 +2409,7 @@
         </w:tc>
         <w:tc>
           <w:tcPr>
-            <w:tcW w:type="dxa" w:w="1650"/>
+            <w:tcW w:type="dxa" w:w="1440"/>
             <w:tcBorders>
               <w:top w:val="none" w:color="FFFFFF" w:sz="0"/>
               <w:left w:val="none" w:color="FFFFFF" w:sz="0"/>
@@ -2408,7 +2442,7 @@
         </w:tc>
         <w:tc>
           <w:tcPr>
-            <w:tcW w:type="dxa" w:w="1650"/>
+            <w:tcW w:type="dxa" w:w="1440"/>
             <w:tcBorders>
               <w:top w:val="none" w:color="FFFFFF" w:sz="0"/>
               <w:left w:val="none" w:color="FFFFFF" w:sz="0"/>
@@ -2441,7 +2475,40 @@
         </w:tc>
         <w:tc>
           <w:tcPr>
-            <w:tcW w:type="dxa" w:w="1660"/>
+            <w:tcW w:type="dxa" w:w="1440"/>
+            <w:tcBorders>
+              <w:top w:val="none" w:color="FFFFFF" w:sz="0"/>
+              <w:left w:val="none" w:color="FFFFFF" w:sz="0"/>
+              <w:bottom w:val="none" w:color="FFFFFF" w:sz="0"/>
+              <w:right w:val="none" w:color="FFFFFF" w:sz="0"/>
+            </w:tcBorders>
+            <w:tcMar>
+              <w:top w:type="dxa" w:w="35"/>
+              <w:left w:type="dxa" w:w="70"/>
+              <w:bottom w:type="dxa" w:w="35"/>
+              <w:right w:type="dxa" w:w="70"/>
+            </w:tcMar>
+          </w:tcPr>
+          <w:p>
+            <w:pPr>
+              <w:keepNext/>
+              <w:jc w:val="center"/>
+            </w:pPr>
+            <w:r>
+              <w:rPr>
+                <w:rFonts w:ascii="Times New Roman" w:cs="Times New Roman" w:eastAsia="Times New Roman" w:hAnsi="Times New Roman"/>
+                <w:b w:val="false"/>
+                <w:bCs w:val="false"/>
+                <w:sz w:val="18"/>
+                <w:szCs w:val="18"/>
+              </w:rPr>
+              <w:t xml:space="preserve">0.989</w:t>
+            </w:r>
+          </w:p>
+        </w:tc>
+        <w:tc>
+          <w:tcPr>
+            <w:tcW w:type="dxa" w:w="1440"/>
             <w:tcBorders>
               <w:top w:val="none" w:color="FFFFFF" w:sz="0"/>
               <w:left w:val="none" w:color="FFFFFF" w:sz="0"/>
@@ -2479,7 +2546,7 @@
         </w:trPr>
         <w:tc>
           <w:tcPr>
-            <w:tcW w:type="dxa" w:w="3300"/>
+            <w:tcW w:type="dxa" w:w="2700"/>
             <w:tcBorders>
               <w:top w:val="none" w:color="FFFFFF" w:sz="0"/>
               <w:left w:val="none" w:color="FFFFFF" w:sz="0"/>
@@ -2512,7 +2579,7 @@
         </w:tc>
         <w:tc>
           <w:tcPr>
-            <w:tcW w:type="dxa" w:w="1100"/>
+            <w:tcW w:type="dxa" w:w="900"/>
             <w:tcBorders>
               <w:top w:val="none" w:color="FFFFFF" w:sz="0"/>
               <w:left w:val="none" w:color="FFFFFF" w:sz="0"/>
@@ -2545,7 +2612,7 @@
         </w:tc>
         <w:tc>
           <w:tcPr>
-            <w:tcW w:type="dxa" w:w="1650"/>
+            <w:tcW w:type="dxa" w:w="1440"/>
             <w:tcBorders>
               <w:top w:val="none" w:color="FFFFFF" w:sz="0"/>
               <w:left w:val="none" w:color="FFFFFF" w:sz="0"/>
@@ -2578,7 +2645,7 @@
         </w:tc>
         <w:tc>
           <w:tcPr>
-            <w:tcW w:type="dxa" w:w="1650"/>
+            <w:tcW w:type="dxa" w:w="1440"/>
             <w:tcBorders>
               <w:top w:val="none" w:color="FFFFFF" w:sz="0"/>
               <w:left w:val="none" w:color="FFFFFF" w:sz="0"/>
@@ -2611,7 +2678,40 @@
         </w:tc>
         <w:tc>
           <w:tcPr>
-            <w:tcW w:type="dxa" w:w="1660"/>
+            <w:tcW w:type="dxa" w:w="1440"/>
+            <w:tcBorders>
+              <w:top w:val="none" w:color="FFFFFF" w:sz="0"/>
+              <w:left w:val="none" w:color="FFFFFF" w:sz="0"/>
+              <w:bottom w:val="none" w:color="FFFFFF" w:sz="0"/>
+              <w:right w:val="none" w:color="FFFFFF" w:sz="0"/>
+            </w:tcBorders>
+            <w:tcMar>
+              <w:top w:type="dxa" w:w="35"/>
+              <w:left w:type="dxa" w:w="70"/>
+              <w:bottom w:type="dxa" w:w="35"/>
+              <w:right w:type="dxa" w:w="70"/>
+            </w:tcMar>
+          </w:tcPr>
+          <w:p>
+            <w:pPr>
+              <w:keepNext/>
+              <w:jc w:val="center"/>
+            </w:pPr>
+            <w:r>
+              <w:rPr>
+                <w:rFonts w:ascii="Times New Roman" w:cs="Times New Roman" w:eastAsia="Times New Roman" w:hAnsi="Times New Roman"/>
+                <w:b w:val="false"/>
+                <w:bCs w:val="false"/>
+                <w:sz w:val="18"/>
+                <w:szCs w:val="18"/>
+              </w:rPr>
+              <w:t xml:space="preserve">0.999</w:t>
+            </w:r>
+          </w:p>
+        </w:tc>
+        <w:tc>
+          <w:tcPr>
+            <w:tcW w:type="dxa" w:w="1440"/>
             <w:tcBorders>
               <w:top w:val="none" w:color="FFFFFF" w:sz="0"/>
               <w:left w:val="none" w:color="FFFFFF" w:sz="0"/>
@@ -2649,7 +2749,7 @@
         </w:trPr>
         <w:tc>
           <w:tcPr>
-            <w:tcW w:type="dxa" w:w="3300"/>
+            <w:tcW w:type="dxa" w:w="2700"/>
             <w:tcBorders>
               <w:top w:val="none" w:color="FFFFFF" w:sz="0"/>
               <w:left w:val="none" w:color="FFFFFF" w:sz="0"/>
@@ -2682,7 +2782,7 @@
         </w:tc>
         <w:tc>
           <w:tcPr>
-            <w:tcW w:type="dxa" w:w="1100"/>
+            <w:tcW w:type="dxa" w:w="900"/>
             <w:tcBorders>
               <w:top w:val="none" w:color="FFFFFF" w:sz="0"/>
               <w:left w:val="none" w:color="FFFFFF" w:sz="0"/>
@@ -2715,7 +2815,7 @@
         </w:tc>
         <w:tc>
           <w:tcPr>
-            <w:tcW w:type="dxa" w:w="1650"/>
+            <w:tcW w:type="dxa" w:w="1440"/>
             <w:tcBorders>
               <w:top w:val="none" w:color="FFFFFF" w:sz="0"/>
               <w:left w:val="none" w:color="FFFFFF" w:sz="0"/>
@@ -2748,7 +2848,7 @@
         </w:tc>
         <w:tc>
           <w:tcPr>
-            <w:tcW w:type="dxa" w:w="1650"/>
+            <w:tcW w:type="dxa" w:w="1440"/>
             <w:tcBorders>
               <w:top w:val="none" w:color="FFFFFF" w:sz="0"/>
               <w:left w:val="none" w:color="FFFFFF" w:sz="0"/>
@@ -2781,34 +2881,67 @@
         </w:tc>
         <w:tc>
           <w:tcPr>
-            <w:tcW w:type="dxa" w:w="1660"/>
-            <w:tcBorders>
-              <w:top w:val="none" w:color="FFFFFF" w:sz="0"/>
-              <w:left w:val="none" w:color="FFFFFF" w:sz="0"/>
-              <w:bottom w:val="none" w:color="FFFFFF" w:sz="0"/>
-              <w:right w:val="none" w:color="FFFFFF" w:sz="0"/>
-            </w:tcBorders>
-            <w:tcMar>
-              <w:top w:type="dxa" w:w="35"/>
-              <w:left w:type="dxa" w:w="70"/>
-              <w:bottom w:type="dxa" w:w="35"/>
-              <w:right w:type="dxa" w:w="70"/>
-            </w:tcMar>
-          </w:tcPr>
-          <w:p>
-            <w:pPr>
-              <w:keepNext/>
-              <w:jc w:val="center"/>
-            </w:pPr>
-            <w:r>
-              <w:rPr>
-                <w:rFonts w:ascii="Times New Roman" w:cs="Times New Roman" w:eastAsia="Times New Roman" w:hAnsi="Times New Roman"/>
-                <w:b w:val="false"/>
-                <w:bCs w:val="false"/>
-                <w:sz w:val="18"/>
-                <w:szCs w:val="18"/>
-              </w:rPr>
-              <w:t xml:space="preserve">0.949</w:t>
+            <w:tcW w:type="dxa" w:w="1440"/>
+            <w:tcBorders>
+              <w:top w:val="none" w:color="FFFFFF" w:sz="0"/>
+              <w:left w:val="none" w:color="FFFFFF" w:sz="0"/>
+              <w:bottom w:val="none" w:color="FFFFFF" w:sz="0"/>
+              <w:right w:val="none" w:color="FFFFFF" w:sz="0"/>
+            </w:tcBorders>
+            <w:tcMar>
+              <w:top w:type="dxa" w:w="35"/>
+              <w:left w:type="dxa" w:w="70"/>
+              <w:bottom w:type="dxa" w:w="35"/>
+              <w:right w:type="dxa" w:w="70"/>
+            </w:tcMar>
+          </w:tcPr>
+          <w:p>
+            <w:pPr>
+              <w:keepNext/>
+              <w:jc w:val="center"/>
+            </w:pPr>
+            <w:r>
+              <w:rPr>
+                <w:rFonts w:ascii="Times New Roman" w:cs="Times New Roman" w:eastAsia="Times New Roman" w:hAnsi="Times New Roman"/>
+                <w:b w:val="false"/>
+                <w:bCs w:val="false"/>
+                <w:sz w:val="18"/>
+                <w:szCs w:val="18"/>
+              </w:rPr>
+              <w:t xml:space="preserve">0.940</w:t>
+            </w:r>
+          </w:p>
+        </w:tc>
+        <w:tc>
+          <w:tcPr>
+            <w:tcW w:type="dxa" w:w="1440"/>
+            <w:tcBorders>
+              <w:top w:val="none" w:color="FFFFFF" w:sz="0"/>
+              <w:left w:val="none" w:color="FFFFFF" w:sz="0"/>
+              <w:bottom w:val="none" w:color="FFFFFF" w:sz="0"/>
+              <w:right w:val="none" w:color="FFFFFF" w:sz="0"/>
+            </w:tcBorders>
+            <w:tcMar>
+              <w:top w:type="dxa" w:w="35"/>
+              <w:left w:type="dxa" w:w="70"/>
+              <w:bottom w:type="dxa" w:w="35"/>
+              <w:right w:type="dxa" w:w="70"/>
+            </w:tcMar>
+          </w:tcPr>
+          <w:p>
+            <w:pPr>
+              <w:keepNext/>
+              <w:jc w:val="center"/>
+            </w:pPr>
+            <w:r>
+              <w:rPr>
+                <w:rFonts w:ascii="Times New Roman" w:cs="Times New Roman" w:eastAsia="Times New Roman" w:hAnsi="Times New Roman"/>
+                <w:b w:val="false"/>
+                <w:bCs w:val="false"/>
+                <w:sz w:val="18"/>
+                <w:szCs w:val="18"/>
+              </w:rPr>
+              <w:t xml:space="preserve">0.948</w:t>
             </w:r>
           </w:p>
         </w:tc>
@@ -2819,7 +2952,7 @@
         </w:trPr>
         <w:tc>
           <w:tcPr>
-            <w:tcW w:type="dxa" w:w="3300"/>
+            <w:tcW w:type="dxa" w:w="2700"/>
             <w:tcBorders>
               <w:top w:val="none" w:color="FFFFFF" w:sz="0"/>
               <w:left w:val="none" w:color="FFFFFF" w:sz="0"/>
@@ -2852,7 +2985,7 @@
         </w:tc>
         <w:tc>
           <w:tcPr>
-            <w:tcW w:type="dxa" w:w="1100"/>
+            <w:tcW w:type="dxa" w:w="900"/>
             <w:tcBorders>
               <w:top w:val="none" w:color="FFFFFF" w:sz="0"/>
               <w:left w:val="none" w:color="FFFFFF" w:sz="0"/>
@@ -2885,7 +3018,7 @@
         </w:tc>
         <w:tc>
           <w:tcPr>
-            <w:tcW w:type="dxa" w:w="1650"/>
+            <w:tcW w:type="dxa" w:w="1440"/>
             <w:tcBorders>
               <w:top w:val="none" w:color="FFFFFF" w:sz="0"/>
               <w:left w:val="none" w:color="FFFFFF" w:sz="0"/>
@@ -2918,7 +3051,7 @@
         </w:tc>
         <w:tc>
           <w:tcPr>
-            <w:tcW w:type="dxa" w:w="1650"/>
+            <w:tcW w:type="dxa" w:w="1440"/>
             <w:tcBorders>
               <w:top w:val="none" w:color="FFFFFF" w:sz="0"/>
               <w:left w:val="none" w:color="FFFFFF" w:sz="0"/>
@@ -2951,34 +3084,67 @@
         </w:tc>
         <w:tc>
           <w:tcPr>
-            <w:tcW w:type="dxa" w:w="1660"/>
-            <w:tcBorders>
-              <w:top w:val="none" w:color="FFFFFF" w:sz="0"/>
-              <w:left w:val="none" w:color="FFFFFF" w:sz="0"/>
-              <w:bottom w:val="none" w:color="FFFFFF" w:sz="0"/>
-              <w:right w:val="none" w:color="FFFFFF" w:sz="0"/>
-            </w:tcBorders>
-            <w:tcMar>
-              <w:top w:type="dxa" w:w="35"/>
-              <w:left w:type="dxa" w:w="70"/>
-              <w:bottom w:type="dxa" w:w="35"/>
-              <w:right w:type="dxa" w:w="70"/>
-            </w:tcMar>
-          </w:tcPr>
-          <w:p>
-            <w:pPr>
-              <w:keepNext/>
-              <w:jc w:val="center"/>
-            </w:pPr>
-            <w:r>
-              <w:rPr>
-                <w:rFonts w:ascii="Times New Roman" w:cs="Times New Roman" w:eastAsia="Times New Roman" w:hAnsi="Times New Roman"/>
-                <w:b w:val="false"/>
-                <w:bCs w:val="false"/>
-                <w:sz w:val="18"/>
-                <w:szCs w:val="18"/>
-              </w:rPr>
-              <w:t xml:space="preserve">0.971</w:t>
+            <w:tcW w:type="dxa" w:w="1440"/>
+            <w:tcBorders>
+              <w:top w:val="none" w:color="FFFFFF" w:sz="0"/>
+              <w:left w:val="none" w:color="FFFFFF" w:sz="0"/>
+              <w:bottom w:val="none" w:color="FFFFFF" w:sz="0"/>
+              <w:right w:val="none" w:color="FFFFFF" w:sz="0"/>
+            </w:tcBorders>
+            <w:tcMar>
+              <w:top w:type="dxa" w:w="35"/>
+              <w:left w:type="dxa" w:w="70"/>
+              <w:bottom w:type="dxa" w:w="35"/>
+              <w:right w:type="dxa" w:w="70"/>
+            </w:tcMar>
+          </w:tcPr>
+          <w:p>
+            <w:pPr>
+              <w:keepNext/>
+              <w:jc w:val="center"/>
+            </w:pPr>
+            <w:r>
+              <w:rPr>
+                <w:rFonts w:ascii="Times New Roman" w:cs="Times New Roman" w:eastAsia="Times New Roman" w:hAnsi="Times New Roman"/>
+                <w:b w:val="false"/>
+                <w:bCs w:val="false"/>
+                <w:sz w:val="18"/>
+                <w:szCs w:val="18"/>
+              </w:rPr>
+              <w:t xml:space="preserve">0.962</w:t>
+            </w:r>
+          </w:p>
+        </w:tc>
+        <w:tc>
+          <w:tcPr>
+            <w:tcW w:type="dxa" w:w="1440"/>
+            <w:tcBorders>
+              <w:top w:val="none" w:color="FFFFFF" w:sz="0"/>
+              <w:left w:val="none" w:color="FFFFFF" w:sz="0"/>
+              <w:bottom w:val="none" w:color="FFFFFF" w:sz="0"/>
+              <w:right w:val="none" w:color="FFFFFF" w:sz="0"/>
+            </w:tcBorders>
+            <w:tcMar>
+              <w:top w:type="dxa" w:w="35"/>
+              <w:left w:type="dxa" w:w="70"/>
+              <w:bottom w:type="dxa" w:w="35"/>
+              <w:right w:type="dxa" w:w="70"/>
+            </w:tcMar>
+          </w:tcPr>
+          <w:p>
+            <w:pPr>
+              <w:keepNext/>
+              <w:jc w:val="center"/>
+            </w:pPr>
+            <w:r>
+              <w:rPr>
+                <w:rFonts w:ascii="Times New Roman" w:cs="Times New Roman" w:eastAsia="Times New Roman" w:hAnsi="Times New Roman"/>
+                <w:b w:val="false"/>
+                <w:bCs w:val="false"/>
+                <w:sz w:val="18"/>
+                <w:szCs w:val="18"/>
+              </w:rPr>
+              <w:t xml:space="preserve">0.974</w:t>
             </w:r>
           </w:p>
         </w:tc>
@@ -2989,7 +3155,7 @@
         </w:trPr>
         <w:tc>
           <w:tcPr>
-            <w:tcW w:type="dxa" w:w="3300"/>
+            <w:tcW w:type="dxa" w:w="2700"/>
             <w:tcBorders>
               <w:top w:val="none" w:color="FFFFFF" w:sz="0"/>
               <w:left w:val="none" w:color="FFFFFF" w:sz="0"/>
@@ -3022,7 +3188,7 @@
         </w:tc>
         <w:tc>
           <w:tcPr>
-            <w:tcW w:type="dxa" w:w="1100"/>
+            <w:tcW w:type="dxa" w:w="900"/>
             <w:tcBorders>
               <w:top w:val="none" w:color="FFFFFF" w:sz="0"/>
               <w:left w:val="none" w:color="FFFFFF" w:sz="0"/>
@@ -3055,7 +3221,7 @@
         </w:tc>
         <w:tc>
           <w:tcPr>
-            <w:tcW w:type="dxa" w:w="1650"/>
+            <w:tcW w:type="dxa" w:w="1440"/>
             <w:tcBorders>
               <w:top w:val="none" w:color="FFFFFF" w:sz="0"/>
               <w:left w:val="none" w:color="FFFFFF" w:sz="0"/>
@@ -3088,7 +3254,7 @@
         </w:tc>
         <w:tc>
           <w:tcPr>
-            <w:tcW w:type="dxa" w:w="1650"/>
+            <w:tcW w:type="dxa" w:w="1440"/>
             <w:tcBorders>
               <w:top w:val="none" w:color="FFFFFF" w:sz="0"/>
               <w:left w:val="none" w:color="FFFFFF" w:sz="0"/>
@@ -3121,34 +3287,67 @@
         </w:tc>
         <w:tc>
           <w:tcPr>
-            <w:tcW w:type="dxa" w:w="1660"/>
-            <w:tcBorders>
-              <w:top w:val="none" w:color="FFFFFF" w:sz="0"/>
-              <w:left w:val="none" w:color="FFFFFF" w:sz="0"/>
-              <w:bottom w:val="none" w:color="FFFFFF" w:sz="0"/>
-              <w:right w:val="none" w:color="FFFFFF" w:sz="0"/>
-            </w:tcBorders>
-            <w:tcMar>
-              <w:top w:type="dxa" w:w="35"/>
-              <w:left w:type="dxa" w:w="70"/>
-              <w:bottom w:type="dxa" w:w="35"/>
-              <w:right w:type="dxa" w:w="70"/>
-            </w:tcMar>
-          </w:tcPr>
-          <w:p>
-            <w:pPr>
-              <w:keepNext/>
-              <w:jc w:val="center"/>
-            </w:pPr>
-            <w:r>
-              <w:rPr>
-                <w:rFonts w:ascii="Times New Roman" w:cs="Times New Roman" w:eastAsia="Times New Roman" w:hAnsi="Times New Roman"/>
-                <w:b w:val="false"/>
-                <w:bCs w:val="false"/>
-                <w:sz w:val="18"/>
-                <w:szCs w:val="18"/>
-              </w:rPr>
-              <w:t xml:space="preserve">0.904</w:t>
+            <w:tcW w:type="dxa" w:w="1440"/>
+            <w:tcBorders>
+              <w:top w:val="none" w:color="FFFFFF" w:sz="0"/>
+              <w:left w:val="none" w:color="FFFFFF" w:sz="0"/>
+              <w:bottom w:val="none" w:color="FFFFFF" w:sz="0"/>
+              <w:right w:val="none" w:color="FFFFFF" w:sz="0"/>
+            </w:tcBorders>
+            <w:tcMar>
+              <w:top w:type="dxa" w:w="35"/>
+              <w:left w:type="dxa" w:w="70"/>
+              <w:bottom w:type="dxa" w:w="35"/>
+              <w:right w:type="dxa" w:w="70"/>
+            </w:tcMar>
+          </w:tcPr>
+          <w:p>
+            <w:pPr>
+              <w:keepNext/>
+              <w:jc w:val="center"/>
+            </w:pPr>
+            <w:r>
+              <w:rPr>
+                <w:rFonts w:ascii="Times New Roman" w:cs="Times New Roman" w:eastAsia="Times New Roman" w:hAnsi="Times New Roman"/>
+                <w:b w:val="false"/>
+                <w:bCs w:val="false"/>
+                <w:sz w:val="18"/>
+                <w:szCs w:val="18"/>
+              </w:rPr>
+              <w:t xml:space="preserve">0.899</w:t>
+            </w:r>
+          </w:p>
+        </w:tc>
+        <w:tc>
+          <w:tcPr>
+            <w:tcW w:type="dxa" w:w="1440"/>
+            <w:tcBorders>
+              <w:top w:val="none" w:color="FFFFFF" w:sz="0"/>
+              <w:left w:val="none" w:color="FFFFFF" w:sz="0"/>
+              <w:bottom w:val="none" w:color="FFFFFF" w:sz="0"/>
+              <w:right w:val="none" w:color="FFFFFF" w:sz="0"/>
+            </w:tcBorders>
+            <w:tcMar>
+              <w:top w:type="dxa" w:w="35"/>
+              <w:left w:type="dxa" w:w="70"/>
+              <w:bottom w:type="dxa" w:w="35"/>
+              <w:right w:type="dxa" w:w="70"/>
+            </w:tcMar>
+          </w:tcPr>
+          <w:p>
+            <w:pPr>
+              <w:keepNext/>
+              <w:jc w:val="center"/>
+            </w:pPr>
+            <w:r>
+              <w:rPr>
+                <w:rFonts w:ascii="Times New Roman" w:cs="Times New Roman" w:eastAsia="Times New Roman" w:hAnsi="Times New Roman"/>
+                <w:b w:val="false"/>
+                <w:bCs w:val="false"/>
+                <w:sz w:val="18"/>
+                <w:szCs w:val="18"/>
+              </w:rPr>
+              <w:t xml:space="preserve">0.903</w:t>
             </w:r>
           </w:p>
         </w:tc>
@@ -3159,7 +3358,7 @@
         </w:trPr>
         <w:tc>
           <w:tcPr>
-            <w:tcW w:type="dxa" w:w="3300"/>
+            <w:tcW w:type="dxa" w:w="2700"/>
             <w:tcBorders>
               <w:top w:val="none" w:color="FFFFFF" w:sz="0"/>
               <w:left w:val="none" w:color="FFFFFF" w:sz="0"/>
@@ -3192,7 +3391,7 @@
         </w:tc>
         <w:tc>
           <w:tcPr>
-            <w:tcW w:type="dxa" w:w="1100"/>
+            <w:tcW w:type="dxa" w:w="900"/>
             <w:tcBorders>
               <w:top w:val="none" w:color="FFFFFF" w:sz="0"/>
               <w:left w:val="none" w:color="FFFFFF" w:sz="0"/>
@@ -3225,7 +3424,7 @@
         </w:tc>
         <w:tc>
           <w:tcPr>
-            <w:tcW w:type="dxa" w:w="1650"/>
+            <w:tcW w:type="dxa" w:w="1440"/>
             <w:tcBorders>
               <w:top w:val="none" w:color="FFFFFF" w:sz="0"/>
               <w:left w:val="none" w:color="FFFFFF" w:sz="0"/>
@@ -3258,7 +3457,7 @@
         </w:tc>
         <w:tc>
           <w:tcPr>
-            <w:tcW w:type="dxa" w:w="1650"/>
+            <w:tcW w:type="dxa" w:w="1440"/>
             <w:tcBorders>
               <w:top w:val="none" w:color="FFFFFF" w:sz="0"/>
               <w:left w:val="none" w:color="FFFFFF" w:sz="0"/>
@@ -3291,7 +3490,40 @@
         </w:tc>
         <w:tc>
           <w:tcPr>
-            <w:tcW w:type="dxa" w:w="1660"/>
+            <w:tcW w:type="dxa" w:w="1440"/>
+            <w:tcBorders>
+              <w:top w:val="none" w:color="FFFFFF" w:sz="0"/>
+              <w:left w:val="none" w:color="FFFFFF" w:sz="0"/>
+              <w:bottom w:val="none" w:color="FFFFFF" w:sz="0"/>
+              <w:right w:val="none" w:color="FFFFFF" w:sz="0"/>
+            </w:tcBorders>
+            <w:tcMar>
+              <w:top w:type="dxa" w:w="35"/>
+              <w:left w:type="dxa" w:w="70"/>
+              <w:bottom w:type="dxa" w:w="35"/>
+              <w:right w:type="dxa" w:w="70"/>
+            </w:tcMar>
+          </w:tcPr>
+          <w:p>
+            <w:pPr>
+              <w:keepNext/>
+              <w:jc w:val="center"/>
+            </w:pPr>
+            <w:r>
+              <w:rPr>
+                <w:rFonts w:ascii="Times New Roman" w:cs="Times New Roman" w:eastAsia="Times New Roman" w:hAnsi="Times New Roman"/>
+                <w:b w:val="false"/>
+                <w:bCs w:val="false"/>
+                <w:sz w:val="18"/>
+                <w:szCs w:val="18"/>
+              </w:rPr>
+              <w:t xml:space="preserve">0.971</w:t>
+            </w:r>
+          </w:p>
+        </w:tc>
+        <w:tc>
+          <w:tcPr>
+            <w:tcW w:type="dxa" w:w="1440"/>
             <w:tcBorders>
               <w:top w:val="none" w:color="FFFFFF" w:sz="0"/>
               <w:left w:val="none" w:color="FFFFFF" w:sz="0"/>
@@ -3329,7 +3561,7 @@
         </w:trPr>
         <w:tc>
           <w:tcPr>
-            <w:tcW w:type="dxa" w:w="3300"/>
+            <w:tcW w:type="dxa" w:w="2700"/>
             <w:tcBorders>
               <w:top w:val="none" w:color="FFFFFF" w:sz="0"/>
               <w:left w:val="none" w:color="FFFFFF" w:sz="0"/>
@@ -3362,7 +3594,7 @@
         </w:tc>
         <w:tc>
           <w:tcPr>
-            <w:tcW w:type="dxa" w:w="1100"/>
+            <w:tcW w:type="dxa" w:w="900"/>
             <w:tcBorders>
               <w:top w:val="none" w:color="FFFFFF" w:sz="0"/>
               <w:left w:val="none" w:color="FFFFFF" w:sz="0"/>
@@ -3395,7 +3627,7 @@
         </w:tc>
         <w:tc>
           <w:tcPr>
-            <w:tcW w:type="dxa" w:w="1650"/>
+            <w:tcW w:type="dxa" w:w="1440"/>
             <w:tcBorders>
               <w:top w:val="none" w:color="FFFFFF" w:sz="0"/>
               <w:left w:val="none" w:color="FFFFFF" w:sz="0"/>
@@ -3428,7 +3660,7 @@
         </w:tc>
         <w:tc>
           <w:tcPr>
-            <w:tcW w:type="dxa" w:w="1650"/>
+            <w:tcW w:type="dxa" w:w="1440"/>
             <w:tcBorders>
               <w:top w:val="none" w:color="FFFFFF" w:sz="0"/>
               <w:left w:val="none" w:color="FFFFFF" w:sz="0"/>
@@ -3461,7 +3693,40 @@
         </w:tc>
         <w:tc>
           <w:tcPr>
-            <w:tcW w:type="dxa" w:w="1660"/>
+            <w:tcW w:type="dxa" w:w="1440"/>
+            <w:tcBorders>
+              <w:top w:val="none" w:color="FFFFFF" w:sz="0"/>
+              <w:left w:val="none" w:color="FFFFFF" w:sz="0"/>
+              <w:bottom w:val="none" w:color="FFFFFF" w:sz="0"/>
+              <w:right w:val="none" w:color="FFFFFF" w:sz="0"/>
+            </w:tcBorders>
+            <w:tcMar>
+              <w:top w:type="dxa" w:w="35"/>
+              <w:left w:type="dxa" w:w="70"/>
+              <w:bottom w:type="dxa" w:w="35"/>
+              <w:right w:type="dxa" w:w="70"/>
+            </w:tcMar>
+          </w:tcPr>
+          <w:p>
+            <w:pPr>
+              <w:keepNext/>
+              <w:jc w:val="center"/>
+            </w:pPr>
+            <w:r>
+              <w:rPr>
+                <w:rFonts w:ascii="Times New Roman" w:cs="Times New Roman" w:eastAsia="Times New Roman" w:hAnsi="Times New Roman"/>
+                <w:b w:val="false"/>
+                <w:bCs w:val="false"/>
+                <w:sz w:val="18"/>
+                <w:szCs w:val="18"/>
+              </w:rPr>
+              <w:t xml:space="preserve">0.944</w:t>
+            </w:r>
+          </w:p>
+        </w:tc>
+        <w:tc>
+          <w:tcPr>
+            <w:tcW w:type="dxa" w:w="1440"/>
             <w:tcBorders>
               <w:top w:val="none" w:color="FFFFFF" w:sz="0"/>
               <w:left w:val="none" w:color="FFFFFF" w:sz="0"/>
@@ -3499,7 +3764,7 @@
         </w:trPr>
         <w:tc>
           <w:tcPr>
-            <w:tcW w:type="dxa" w:w="3300"/>
+            <w:tcW w:type="dxa" w:w="2700"/>
             <w:tcBorders>
               <w:top w:val="none" w:color="FFFFFF" w:sz="0"/>
               <w:left w:val="none" w:color="FFFFFF" w:sz="0"/>
@@ -3532,7 +3797,7 @@
         </w:tc>
         <w:tc>
           <w:tcPr>
-            <w:tcW w:type="dxa" w:w="1100"/>
+            <w:tcW w:type="dxa" w:w="900"/>
             <w:tcBorders>
               <w:top w:val="none" w:color="FFFFFF" w:sz="0"/>
               <w:left w:val="none" w:color="FFFFFF" w:sz="0"/>
@@ -3565,7 +3830,7 @@
         </w:tc>
         <w:tc>
           <w:tcPr>
-            <w:tcW w:type="dxa" w:w="1650"/>
+            <w:tcW w:type="dxa" w:w="1440"/>
             <w:tcBorders>
               <w:top w:val="none" w:color="FFFFFF" w:sz="0"/>
               <w:left w:val="none" w:color="FFFFFF" w:sz="0"/>
@@ -3598,7 +3863,7 @@
         </w:tc>
         <w:tc>
           <w:tcPr>
-            <w:tcW w:type="dxa" w:w="1650"/>
+            <w:tcW w:type="dxa" w:w="1440"/>
             <w:tcBorders>
               <w:top w:val="none" w:color="FFFFFF" w:sz="0"/>
               <w:left w:val="none" w:color="FFFFFF" w:sz="0"/>
@@ -3631,7 +3896,7 @@
         </w:tc>
         <w:tc>
           <w:tcPr>
-            <w:tcW w:type="dxa" w:w="1660"/>
+            <w:tcW w:type="dxa" w:w="1440"/>
             <w:tcBorders>
               <w:top w:val="none" w:color="FFFFFF" w:sz="0"/>
               <w:left w:val="none" w:color="FFFFFF" w:sz="0"/>
@@ -3658,7 +3923,40 @@
                 <w:sz w:val="18"/>
                 <w:szCs w:val="18"/>
               </w:rPr>
-              <w:t xml:space="preserve">0.869</w:t>
+              <w:t xml:space="preserve">0.879</w:t>
+            </w:r>
+          </w:p>
+        </w:tc>
+        <w:tc>
+          <w:tcPr>
+            <w:tcW w:type="dxa" w:w="1440"/>
+            <w:tcBorders>
+              <w:top w:val="none" w:color="FFFFFF" w:sz="0"/>
+              <w:left w:val="none" w:color="FFFFFF" w:sz="0"/>
+              <w:bottom w:val="none" w:color="FFFFFF" w:sz="0"/>
+              <w:right w:val="none" w:color="FFFFFF" w:sz="0"/>
+            </w:tcBorders>
+            <w:tcMar>
+              <w:top w:type="dxa" w:w="35"/>
+              <w:left w:type="dxa" w:w="70"/>
+              <w:bottom w:type="dxa" w:w="35"/>
+              <w:right w:type="dxa" w:w="70"/>
+            </w:tcMar>
+          </w:tcPr>
+          <w:p>
+            <w:pPr>
+              <w:keepNext/>
+              <w:jc w:val="center"/>
+            </w:pPr>
+            <w:r>
+              <w:rPr>
+                <w:rFonts w:ascii="Times New Roman" w:cs="Times New Roman" w:eastAsia="Times New Roman" w:hAnsi="Times New Roman"/>
+                <w:b/>
+                <w:bCs/>
+                <w:sz w:val="18"/>
+                <w:szCs w:val="18"/>
+              </w:rPr>
+              <w:t xml:space="preserve">0.873</w:t>
             </w:r>
           </w:p>
         </w:tc>
@@ -3669,7 +3967,7 @@
         </w:trPr>
         <w:tc>
           <w:tcPr>
-            <w:tcW w:type="dxa" w:w="3300"/>
+            <w:tcW w:type="dxa" w:w="2700"/>
             <w:tcBorders>
               <w:top w:val="none" w:color="FFFFFF" w:sz="0"/>
               <w:left w:val="none" w:color="FFFFFF" w:sz="0"/>
@@ -3702,7 +4000,7 @@
         </w:tc>
         <w:tc>
           <w:tcPr>
-            <w:tcW w:type="dxa" w:w="1100"/>
+            <w:tcW w:type="dxa" w:w="900"/>
             <w:tcBorders>
               <w:top w:val="none" w:color="FFFFFF" w:sz="0"/>
               <w:left w:val="none" w:color="FFFFFF" w:sz="0"/>
@@ -3735,7 +4033,7 @@
         </w:tc>
         <w:tc>
           <w:tcPr>
-            <w:tcW w:type="dxa" w:w="1650"/>
+            <w:tcW w:type="dxa" w:w="1440"/>
             <w:tcBorders>
               <w:top w:val="none" w:color="FFFFFF" w:sz="0"/>
               <w:left w:val="none" w:color="FFFFFF" w:sz="0"/>
@@ -3768,7 +4066,7 @@
         </w:tc>
         <w:tc>
           <w:tcPr>
-            <w:tcW w:type="dxa" w:w="1650"/>
+            <w:tcW w:type="dxa" w:w="1440"/>
             <w:tcBorders>
               <w:top w:val="none" w:color="FFFFFF" w:sz="0"/>
               <w:left w:val="none" w:color="FFFFFF" w:sz="0"/>
@@ -3801,7 +4099,7 @@
         </w:tc>
         <w:tc>
           <w:tcPr>
-            <w:tcW w:type="dxa" w:w="1660"/>
+            <w:tcW w:type="dxa" w:w="1440"/>
             <w:tcBorders>
               <w:top w:val="none" w:color="FFFFFF" w:sz="0"/>
               <w:left w:val="none" w:color="FFFFFF" w:sz="0"/>
@@ -3828,7 +4126,40 @@
                 <w:sz w:val="18"/>
                 <w:szCs w:val="18"/>
               </w:rPr>
-              <w:t xml:space="preserve">0.808</w:t>
+              <w:t xml:space="preserve">0.819</w:t>
+            </w:r>
+          </w:p>
+        </w:tc>
+        <w:tc>
+          <w:tcPr>
+            <w:tcW w:type="dxa" w:w="1440"/>
+            <w:tcBorders>
+              <w:top w:val="none" w:color="FFFFFF" w:sz="0"/>
+              <w:left w:val="none" w:color="FFFFFF" w:sz="0"/>
+              <w:bottom w:val="single" w:color="000000" w:sz="10"/>
+              <w:right w:val="none" w:color="FFFFFF" w:sz="0"/>
+            </w:tcBorders>
+            <w:tcMar>
+              <w:top w:type="dxa" w:w="35"/>
+              <w:left w:type="dxa" w:w="70"/>
+              <w:bottom w:type="dxa" w:w="35"/>
+              <w:right w:type="dxa" w:w="70"/>
+            </w:tcMar>
+          </w:tcPr>
+          <w:p>
+            <w:pPr>
+              <w:keepNext w:val="false"/>
+              <w:jc w:val="center"/>
+            </w:pPr>
+            <w:r>
+              <w:rPr>
+                <w:rFonts w:ascii="Times New Roman" w:cs="Times New Roman" w:eastAsia="Times New Roman" w:hAnsi="Times New Roman"/>
+                <w:b w:val="false"/>
+                <w:bCs w:val="false"/>
+                <w:sz w:val="18"/>
+                <w:szCs w:val="18"/>
+              </w:rPr>
+              <w:t xml:space="preserve">0.812</w:t>
             </w:r>
           </w:p>
         </w:tc>
@@ -3896,7 +4227,7 @@
           <w:sz w:val="21"/>
           <w:szCs w:val="21"/>
         </w:rPr>
-        <w:t xml:space="preserve">H5 y H6 empatan en la validación normal, dentro del ruido. Los separa la prueba de estrés (Figura 3): con la validación girada 30°, H6 conserva 0.854 y D5 cae a 0.559; con 60°, H6 baja a 0.734 y los demás quedan por debajo de 0.22. Elegimos H6 porque en el dataset hay pacientes girados dentro del escáner, como el caso 012.</w:t>
+        <w:t xml:space="preserve">H5 y H6 empatan en la validación normal, dentro del ruido. Los separa la prueba de estrés (Figura 3): con la validación girada 30°, H6 conserva 0.854 y D5 cae a 0.559; con 60°, H6 baja a 0.734 y los demás quedan por debajo de 0.22. Elegimos H6 porque en el dataset hay pacientes girados dentro del escáner, como el caso 012. Esta prueba giraba la imagen en píxeles; la sección 5.7 la repite girando al paciente en milímetros.</w:t>
       </w:r>
     </w:p>
     <w:p>
@@ -8829,6 +9160,924 @@
     <w:p>
       <w:pPr>
         <w:keepNext/>
+        <w:spacing w:after="60" w:before="120"/>
+      </w:pPr>
+      <w:r>
+        <w:rPr>
+          <w:rFonts w:ascii="Times New Roman" w:cs="Times New Roman" w:eastAsia="Times New Roman" w:hAnsi="Times New Roman"/>
+          <w:b/>
+          <w:bCs/>
+          <w:i/>
+          <w:iCs/>
+          <w:sz w:val="21"/>
+          <w:szCs w:val="21"/>
+        </w:rPr>
+        <w:t xml:space="preserve">5.7 Correcciones del profesor: orientación, EMA y robustez</w:t>
+      </w:r>
+    </w:p>
+    <w:p>
+      <w:pPr>
+        <w:spacing w:after="95" w:line="250"/>
+        <w:jc w:val="both"/>
+      </w:pPr>
+      <w:r>
+        <w:rPr>
+          <w:rFonts w:ascii="Times New Roman" w:cs="Times New Roman" w:eastAsia="Times New Roman" w:hAnsi="Times New Roman"/>
+          <w:sz w:val="21"/>
+          <w:szCs w:val="21"/>
+        </w:rPr>
+        <w:t xml:space="preserve">Tras la entrega, el profesor pidió tres correcciones: normalizar las rotaciones con los metadatos usando productos punto y cruz [7], no usar el promedio exponencial de los pesos (EMA) y hacer el sistema robusto a imágenes de mala calidad. La orientación se calcula ahora con productos punto y cruz sobre la matriz de dirección de la cabecera (en los 100 casos coincide con la regla anterior). Se agregó además un enderezado opcional del giro del paciente en la camilla, que busca el ángulo de mayor simetría izquierda-derecha del hueso visto desde arriba y lo corrige en milímetros solo si es claro. El modelo final, H7, es la receta de H6 sin EMA y con la rotación de entrenamiento en milímetros: rotar en píxeles deforma la pelvis cuando los píxeles no son cuadrados, como en 10 de los 15 casos de validación. H7 cumple los nueve objetivos en validación y da 0.879 de Dice por fragmento en test (Tabla 3). La Tabla 9 compara H6 y H7 con pacientes girados en milímetros y con imágenes dañadas.</w:t>
+      </w:r>
+    </w:p>
+    <w:p>
+      <w:pPr>
+        <w:keepNext/>
+        <w:spacing w:after="60" w:before="120"/>
+        <w:jc w:val="left"/>
+      </w:pPr>
+      <w:r>
+        <w:rPr>
+          <w:rFonts w:ascii="Times New Roman" w:cs="Times New Roman" w:eastAsia="Times New Roman" w:hAnsi="Times New Roman"/>
+          <w:sz w:val="18"/>
+          <w:szCs w:val="18"/>
+        </w:rPr>
+        <w:t xml:space="preserve">Tabla 9. H6 frente a H7 en validación, con pacientes girados (en milímetros) e imágenes dañadas. Dice por fragmento.</w:t>
+      </w:r>
+    </w:p>
+    <w:tbl>
+      <w:tblPr>
+        <w:tblW w:type="dxa" w:w="9360"/>
+        <w:jc w:val="center"/>
+        <w:tblBorders>
+          <w:top w:val="single" w:color="auto" w:sz="4"/>
+          <w:left w:val="single" w:color="auto" w:sz="4"/>
+          <w:bottom w:val="single" w:color="auto" w:sz="4"/>
+          <w:right w:val="single" w:color="auto" w:sz="4"/>
+          <w:insideH w:val="single" w:color="auto" w:sz="4"/>
+          <w:insideV w:val="single" w:color="auto" w:sz="4"/>
+        </w:tblBorders>
+      </w:tblPr>
+      <w:tblGrid>
+        <w:gridCol w:w="2700"/>
+        <w:gridCol w:w="3330"/>
+        <w:gridCol w:w="3330"/>
+      </w:tblGrid>
+      <w:tr>
+        <w:trPr>
+          <w:cantSplit/>
+          <w:tblHeader/>
+        </w:trPr>
+        <w:tc>
+          <w:tcPr>
+            <w:tcW w:type="dxa" w:w="2700"/>
+            <w:tcBorders>
+              <w:top w:val="single" w:color="000000" w:sz="10"/>
+              <w:left w:val="none" w:color="FFFFFF" w:sz="0"/>
+              <w:bottom w:val="single" w:color="000000" w:sz="4"/>
+              <w:right w:val="none" w:color="FFFFFF" w:sz="0"/>
+            </w:tcBorders>
+            <w:tcMar>
+              <w:top w:type="dxa" w:w="35"/>
+              <w:left w:type="dxa" w:w="70"/>
+              <w:bottom w:type="dxa" w:w="35"/>
+              <w:right w:type="dxa" w:w="70"/>
+            </w:tcMar>
+          </w:tcPr>
+          <w:p>
+            <w:pPr>
+              <w:keepNext/>
+              <w:jc w:val="left"/>
+            </w:pPr>
+            <w:r>
+              <w:rPr>
+                <w:rFonts w:ascii="Times New Roman" w:cs="Times New Roman" w:eastAsia="Times New Roman" w:hAnsi="Times New Roman"/>
+                <w:b/>
+                <w:bCs/>
+                <w:sz w:val="18"/>
+                <w:szCs w:val="18"/>
+              </w:rPr>
+              <w:t xml:space="preserve">Prueba</w:t>
+            </w:r>
+          </w:p>
+        </w:tc>
+        <w:tc>
+          <w:tcPr>
+            <w:tcW w:type="dxa" w:w="3330"/>
+            <w:tcBorders>
+              <w:top w:val="single" w:color="000000" w:sz="10"/>
+              <w:left w:val="none" w:color="FFFFFF" w:sz="0"/>
+              <w:bottom w:val="single" w:color="000000" w:sz="4"/>
+              <w:right w:val="none" w:color="FFFFFF" w:sz="0"/>
+            </w:tcBorders>
+            <w:tcMar>
+              <w:top w:type="dxa" w:w="35"/>
+              <w:left w:type="dxa" w:w="70"/>
+              <w:bottom w:type="dxa" w:w="35"/>
+              <w:right w:type="dxa" w:w="70"/>
+            </w:tcMar>
+          </w:tcPr>
+          <w:p>
+            <w:pPr>
+              <w:keepNext/>
+              <w:jc w:val="center"/>
+            </w:pPr>
+            <w:r>
+              <w:rPr>
+                <w:rFonts w:ascii="Times New Roman" w:cs="Times New Roman" w:eastAsia="Times New Roman" w:hAnsi="Times New Roman"/>
+                <w:b/>
+                <w:bCs/>
+                <w:sz w:val="18"/>
+                <w:szCs w:val="18"/>
+              </w:rPr>
+              <w:t xml:space="preserve">H6 (EMA, giro en píxeles)</w:t>
+            </w:r>
+          </w:p>
+        </w:tc>
+        <w:tc>
+          <w:tcPr>
+            <w:tcW w:type="dxa" w:w="3330"/>
+            <w:tcBorders>
+              <w:top w:val="single" w:color="000000" w:sz="10"/>
+              <w:left w:val="none" w:color="FFFFFF" w:sz="0"/>
+              <w:bottom w:val="single" w:color="000000" w:sz="4"/>
+              <w:right w:val="none" w:color="FFFFFF" w:sz="0"/>
+            </w:tcBorders>
+            <w:tcMar>
+              <w:top w:type="dxa" w:w="35"/>
+              <w:left w:type="dxa" w:w="70"/>
+              <w:bottom w:type="dxa" w:w="35"/>
+              <w:right w:type="dxa" w:w="70"/>
+            </w:tcMar>
+          </w:tcPr>
+          <w:p>
+            <w:pPr>
+              <w:keepNext/>
+              <w:jc w:val="center"/>
+            </w:pPr>
+            <w:r>
+              <w:rPr>
+                <w:rFonts w:ascii="Times New Roman" w:cs="Times New Roman" w:eastAsia="Times New Roman" w:hAnsi="Times New Roman"/>
+                <w:b/>
+                <w:bCs/>
+                <w:sz w:val="18"/>
+                <w:szCs w:val="18"/>
+              </w:rPr>
+              <w:t xml:space="preserve">H7 (sin EMA, giro en mm)</w:t>
+            </w:r>
+          </w:p>
+        </w:tc>
+      </w:tr>
+      <w:tr>
+        <w:trPr>
+          <w:cantSplit/>
+        </w:trPr>
+        <w:tc>
+          <w:tcPr>
+            <w:tcW w:type="dxa" w:w="2700"/>
+            <w:tcBorders>
+              <w:top w:val="none" w:color="FFFFFF" w:sz="0"/>
+              <w:left w:val="none" w:color="FFFFFF" w:sz="0"/>
+              <w:bottom w:val="none" w:color="FFFFFF" w:sz="0"/>
+              <w:right w:val="none" w:color="FFFFFF" w:sz="0"/>
+            </w:tcBorders>
+            <w:tcMar>
+              <w:top w:type="dxa" w:w="35"/>
+              <w:left w:type="dxa" w:w="70"/>
+              <w:bottom w:type="dxa" w:w="35"/>
+              <w:right w:type="dxa" w:w="70"/>
+            </w:tcMar>
+          </w:tcPr>
+          <w:p>
+            <w:pPr>
+              <w:keepNext/>
+              <w:jc w:val="left"/>
+            </w:pPr>
+            <w:r>
+              <w:rPr>
+                <w:rFonts w:ascii="Times New Roman" w:cs="Times New Roman" w:eastAsia="Times New Roman" w:hAnsi="Times New Roman"/>
+                <w:b w:val="false"/>
+                <w:bCs w:val="false"/>
+                <w:sz w:val="18"/>
+                <w:szCs w:val="18"/>
+              </w:rPr>
+              <w:t xml:space="preserve">Sin daño</w:t>
+            </w:r>
+          </w:p>
+        </w:tc>
+        <w:tc>
+          <w:tcPr>
+            <w:tcW w:type="dxa" w:w="3330"/>
+            <w:tcBorders>
+              <w:top w:val="none" w:color="FFFFFF" w:sz="0"/>
+              <w:left w:val="none" w:color="FFFFFF" w:sz="0"/>
+              <w:bottom w:val="none" w:color="FFFFFF" w:sz="0"/>
+              <w:right w:val="none" w:color="FFFFFF" w:sz="0"/>
+            </w:tcBorders>
+            <w:tcMar>
+              <w:top w:type="dxa" w:w="35"/>
+              <w:left w:type="dxa" w:w="70"/>
+              <w:bottom w:type="dxa" w:w="35"/>
+              <w:right w:type="dxa" w:w="70"/>
+            </w:tcMar>
+          </w:tcPr>
+          <w:p>
+            <w:pPr>
+              <w:keepNext/>
+              <w:jc w:val="center"/>
+            </w:pPr>
+            <w:r>
+              <w:rPr>
+                <w:rFonts w:ascii="Times New Roman" w:cs="Times New Roman" w:eastAsia="Times New Roman" w:hAnsi="Times New Roman"/>
+                <w:b w:val="false"/>
+                <w:bCs w:val="false"/>
+                <w:sz w:val="18"/>
+                <w:szCs w:val="18"/>
+              </w:rPr>
+              <w:t xml:space="preserve">0.869</w:t>
+            </w:r>
+          </w:p>
+        </w:tc>
+        <w:tc>
+          <w:tcPr>
+            <w:tcW w:type="dxa" w:w="3330"/>
+            <w:tcBorders>
+              <w:top w:val="none" w:color="FFFFFF" w:sz="0"/>
+              <w:left w:val="none" w:color="FFFFFF" w:sz="0"/>
+              <w:bottom w:val="none" w:color="FFFFFF" w:sz="0"/>
+              <w:right w:val="none" w:color="FFFFFF" w:sz="0"/>
+            </w:tcBorders>
+            <w:tcMar>
+              <w:top w:type="dxa" w:w="35"/>
+              <w:left w:type="dxa" w:w="70"/>
+              <w:bottom w:type="dxa" w:w="35"/>
+              <w:right w:type="dxa" w:w="70"/>
+            </w:tcMar>
+          </w:tcPr>
+          <w:p>
+            <w:pPr>
+              <w:keepNext/>
+              <w:jc w:val="center"/>
+            </w:pPr>
+            <w:r>
+              <w:rPr>
+                <w:rFonts w:ascii="Times New Roman" w:cs="Times New Roman" w:eastAsia="Times New Roman" w:hAnsi="Times New Roman"/>
+                <w:b w:val="false"/>
+                <w:bCs w:val="false"/>
+                <w:sz w:val="18"/>
+                <w:szCs w:val="18"/>
+              </w:rPr>
+              <w:t xml:space="preserve">0.873</w:t>
+            </w:r>
+          </w:p>
+        </w:tc>
+      </w:tr>
+      <w:tr>
+        <w:trPr>
+          <w:cantSplit/>
+        </w:trPr>
+        <w:tc>
+          <w:tcPr>
+            <w:tcW w:type="dxa" w:w="2700"/>
+            <w:tcBorders>
+              <w:top w:val="none" w:color="FFFFFF" w:sz="0"/>
+              <w:left w:val="none" w:color="FFFFFF" w:sz="0"/>
+              <w:bottom w:val="none" w:color="FFFFFF" w:sz="0"/>
+              <w:right w:val="none" w:color="FFFFFF" w:sz="0"/>
+            </w:tcBorders>
+            <w:tcMar>
+              <w:top w:type="dxa" w:w="35"/>
+              <w:left w:type="dxa" w:w="70"/>
+              <w:bottom w:type="dxa" w:w="35"/>
+              <w:right w:type="dxa" w:w="70"/>
+            </w:tcMar>
+          </w:tcPr>
+          <w:p>
+            <w:pPr>
+              <w:keepNext/>
+              <w:jc w:val="left"/>
+            </w:pPr>
+            <w:r>
+              <w:rPr>
+                <w:rFonts w:ascii="Times New Roman" w:cs="Times New Roman" w:eastAsia="Times New Roman" w:hAnsi="Times New Roman"/>
+                <w:b w:val="false"/>
+                <w:bCs w:val="false"/>
+                <w:sz w:val="18"/>
+                <w:szCs w:val="18"/>
+              </w:rPr>
+              <w:t xml:space="preserve">Girado 60°</w:t>
+            </w:r>
+          </w:p>
+        </w:tc>
+        <w:tc>
+          <w:tcPr>
+            <w:tcW w:type="dxa" w:w="3330"/>
+            <w:tcBorders>
+              <w:top w:val="none" w:color="FFFFFF" w:sz="0"/>
+              <w:left w:val="none" w:color="FFFFFF" w:sz="0"/>
+              <w:bottom w:val="none" w:color="FFFFFF" w:sz="0"/>
+              <w:right w:val="none" w:color="FFFFFF" w:sz="0"/>
+            </w:tcBorders>
+            <w:tcMar>
+              <w:top w:type="dxa" w:w="35"/>
+              <w:left w:type="dxa" w:w="70"/>
+              <w:bottom w:type="dxa" w:w="35"/>
+              <w:right w:type="dxa" w:w="70"/>
+            </w:tcMar>
+          </w:tcPr>
+          <w:p>
+            <w:pPr>
+              <w:keepNext/>
+              <w:jc w:val="center"/>
+            </w:pPr>
+            <w:r>
+              <w:rPr>
+                <w:rFonts w:ascii="Times New Roman" w:cs="Times New Roman" w:eastAsia="Times New Roman" w:hAnsi="Times New Roman"/>
+                <w:b w:val="false"/>
+                <w:bCs w:val="false"/>
+                <w:sz w:val="18"/>
+                <w:szCs w:val="18"/>
+              </w:rPr>
+              <w:t xml:space="preserve">0.608</w:t>
+            </w:r>
+          </w:p>
+        </w:tc>
+        <w:tc>
+          <w:tcPr>
+            <w:tcW w:type="dxa" w:w="3330"/>
+            <w:tcBorders>
+              <w:top w:val="none" w:color="FFFFFF" w:sz="0"/>
+              <w:left w:val="none" w:color="FFFFFF" w:sz="0"/>
+              <w:bottom w:val="none" w:color="FFFFFF" w:sz="0"/>
+              <w:right w:val="none" w:color="FFFFFF" w:sz="0"/>
+            </w:tcBorders>
+            <w:tcMar>
+              <w:top w:type="dxa" w:w="35"/>
+              <w:left w:type="dxa" w:w="70"/>
+              <w:bottom w:type="dxa" w:w="35"/>
+              <w:right w:type="dxa" w:w="70"/>
+            </w:tcMar>
+          </w:tcPr>
+          <w:p>
+            <w:pPr>
+              <w:keepNext/>
+              <w:jc w:val="center"/>
+            </w:pPr>
+            <w:r>
+              <w:rPr>
+                <w:rFonts w:ascii="Times New Roman" w:cs="Times New Roman" w:eastAsia="Times New Roman" w:hAnsi="Times New Roman"/>
+                <w:b w:val="false"/>
+                <w:bCs w:val="false"/>
+                <w:sz w:val="18"/>
+                <w:szCs w:val="18"/>
+              </w:rPr>
+              <w:t xml:space="preserve">0.636</w:t>
+            </w:r>
+          </w:p>
+        </w:tc>
+      </w:tr>
+      <w:tr>
+        <w:trPr>
+          <w:cantSplit/>
+        </w:trPr>
+        <w:tc>
+          <w:tcPr>
+            <w:tcW w:type="dxa" w:w="2700"/>
+            <w:tcBorders>
+              <w:top w:val="none" w:color="FFFFFF" w:sz="0"/>
+              <w:left w:val="none" w:color="FFFFFF" w:sz="0"/>
+              <w:bottom w:val="none" w:color="FFFFFF" w:sz="0"/>
+              <w:right w:val="none" w:color="FFFFFF" w:sz="0"/>
+            </w:tcBorders>
+            <w:tcMar>
+              <w:top w:type="dxa" w:w="35"/>
+              <w:left w:type="dxa" w:w="70"/>
+              <w:bottom w:type="dxa" w:w="35"/>
+              <w:right w:type="dxa" w:w="70"/>
+            </w:tcMar>
+          </w:tcPr>
+          <w:p>
+            <w:pPr>
+              <w:keepNext/>
+              <w:jc w:val="left"/>
+            </w:pPr>
+            <w:r>
+              <w:rPr>
+                <w:rFonts w:ascii="Times New Roman" w:cs="Times New Roman" w:eastAsia="Times New Roman" w:hAnsi="Times New Roman"/>
+                <w:b w:val="false"/>
+                <w:bCs w:val="false"/>
+                <w:sz w:val="18"/>
+                <w:szCs w:val="18"/>
+              </w:rPr>
+              <w:t xml:space="preserve">Girado 60° y enderezado</w:t>
+            </w:r>
+          </w:p>
+        </w:tc>
+        <w:tc>
+          <w:tcPr>
+            <w:tcW w:type="dxa" w:w="3330"/>
+            <w:tcBorders>
+              <w:top w:val="none" w:color="FFFFFF" w:sz="0"/>
+              <w:left w:val="none" w:color="FFFFFF" w:sz="0"/>
+              <w:bottom w:val="none" w:color="FFFFFF" w:sz="0"/>
+              <w:right w:val="none" w:color="FFFFFF" w:sz="0"/>
+            </w:tcBorders>
+            <w:tcMar>
+              <w:top w:type="dxa" w:w="35"/>
+              <w:left w:type="dxa" w:w="70"/>
+              <w:bottom w:type="dxa" w:w="35"/>
+              <w:right w:type="dxa" w:w="70"/>
+            </w:tcMar>
+          </w:tcPr>
+          <w:p>
+            <w:pPr>
+              <w:keepNext/>
+              <w:jc w:val="center"/>
+            </w:pPr>
+            <w:r>
+              <w:rPr>
+                <w:rFonts w:ascii="Times New Roman" w:cs="Times New Roman" w:eastAsia="Times New Roman" w:hAnsi="Times New Roman"/>
+                <w:b w:val="false"/>
+                <w:bCs w:val="false"/>
+                <w:sz w:val="18"/>
+                <w:szCs w:val="18"/>
+              </w:rPr>
+              <w:t xml:space="preserve">0.851</w:t>
+            </w:r>
+          </w:p>
+        </w:tc>
+        <w:tc>
+          <w:tcPr>
+            <w:tcW w:type="dxa" w:w="3330"/>
+            <w:tcBorders>
+              <w:top w:val="none" w:color="FFFFFF" w:sz="0"/>
+              <w:left w:val="none" w:color="FFFFFF" w:sz="0"/>
+              <w:bottom w:val="none" w:color="FFFFFF" w:sz="0"/>
+              <w:right w:val="none" w:color="FFFFFF" w:sz="0"/>
+            </w:tcBorders>
+            <w:tcMar>
+              <w:top w:type="dxa" w:w="35"/>
+              <w:left w:type="dxa" w:w="70"/>
+              <w:bottom w:type="dxa" w:w="35"/>
+              <w:right w:type="dxa" w:w="70"/>
+            </w:tcMar>
+          </w:tcPr>
+          <w:p>
+            <w:pPr>
+              <w:keepNext/>
+              <w:jc w:val="center"/>
+            </w:pPr>
+            <w:r>
+              <w:rPr>
+                <w:rFonts w:ascii="Times New Roman" w:cs="Times New Roman" w:eastAsia="Times New Roman" w:hAnsi="Times New Roman"/>
+                <w:b w:val="false"/>
+                <w:bCs w:val="false"/>
+                <w:sz w:val="18"/>
+                <w:szCs w:val="18"/>
+              </w:rPr>
+              <w:t xml:space="preserve">0.855</w:t>
+            </w:r>
+          </w:p>
+        </w:tc>
+      </w:tr>
+      <w:tr>
+        <w:trPr>
+          <w:cantSplit/>
+        </w:trPr>
+        <w:tc>
+          <w:tcPr>
+            <w:tcW w:type="dxa" w:w="2700"/>
+            <w:tcBorders>
+              <w:top w:val="none" w:color="FFFFFF" w:sz="0"/>
+              <w:left w:val="none" w:color="FFFFFF" w:sz="0"/>
+              <w:bottom w:val="none" w:color="FFFFFF" w:sz="0"/>
+              <w:right w:val="none" w:color="FFFFFF" w:sz="0"/>
+            </w:tcBorders>
+            <w:tcMar>
+              <w:top w:type="dxa" w:w="35"/>
+              <w:left w:type="dxa" w:w="70"/>
+              <w:bottom w:type="dxa" w:w="35"/>
+              <w:right w:type="dxa" w:w="70"/>
+            </w:tcMar>
+          </w:tcPr>
+          <w:p>
+            <w:pPr>
+              <w:keepNext/>
+              <w:jc w:val="left"/>
+            </w:pPr>
+            <w:r>
+              <w:rPr>
+                <w:rFonts w:ascii="Times New Roman" w:cs="Times New Roman" w:eastAsia="Times New Roman" w:hAnsi="Times New Roman"/>
+                <w:b w:val="false"/>
+                <w:bCs w:val="false"/>
+                <w:sz w:val="18"/>
+                <w:szCs w:val="18"/>
+              </w:rPr>
+              <w:t xml:space="preserve">Desenfoque (σ = 1.5 px)</w:t>
+            </w:r>
+          </w:p>
+        </w:tc>
+        <w:tc>
+          <w:tcPr>
+            <w:tcW w:type="dxa" w:w="3330"/>
+            <w:tcBorders>
+              <w:top w:val="none" w:color="FFFFFF" w:sz="0"/>
+              <w:left w:val="none" w:color="FFFFFF" w:sz="0"/>
+              <w:bottom w:val="none" w:color="FFFFFF" w:sz="0"/>
+              <w:right w:val="none" w:color="FFFFFF" w:sz="0"/>
+            </w:tcBorders>
+            <w:tcMar>
+              <w:top w:type="dxa" w:w="35"/>
+              <w:left w:type="dxa" w:w="70"/>
+              <w:bottom w:type="dxa" w:w="35"/>
+              <w:right w:type="dxa" w:w="70"/>
+            </w:tcMar>
+          </w:tcPr>
+          <w:p>
+            <w:pPr>
+              <w:keepNext/>
+              <w:jc w:val="center"/>
+            </w:pPr>
+            <w:r>
+              <w:rPr>
+                <w:rFonts w:ascii="Times New Roman" w:cs="Times New Roman" w:eastAsia="Times New Roman" w:hAnsi="Times New Roman"/>
+                <w:b w:val="false"/>
+                <w:bCs w:val="false"/>
+                <w:sz w:val="18"/>
+                <w:szCs w:val="18"/>
+              </w:rPr>
+              <w:t xml:space="preserve">0.818</w:t>
+            </w:r>
+          </w:p>
+        </w:tc>
+        <w:tc>
+          <w:tcPr>
+            <w:tcW w:type="dxa" w:w="3330"/>
+            <w:tcBorders>
+              <w:top w:val="none" w:color="FFFFFF" w:sz="0"/>
+              <w:left w:val="none" w:color="FFFFFF" w:sz="0"/>
+              <w:bottom w:val="none" w:color="FFFFFF" w:sz="0"/>
+              <w:right w:val="none" w:color="FFFFFF" w:sz="0"/>
+            </w:tcBorders>
+            <w:tcMar>
+              <w:top w:type="dxa" w:w="35"/>
+              <w:left w:type="dxa" w:w="70"/>
+              <w:bottom w:type="dxa" w:w="35"/>
+              <w:right w:type="dxa" w:w="70"/>
+            </w:tcMar>
+          </w:tcPr>
+          <w:p>
+            <w:pPr>
+              <w:keepNext/>
+              <w:jc w:val="center"/>
+            </w:pPr>
+            <w:r>
+              <w:rPr>
+                <w:rFonts w:ascii="Times New Roman" w:cs="Times New Roman" w:eastAsia="Times New Roman" w:hAnsi="Times New Roman"/>
+                <w:b w:val="false"/>
+                <w:bCs w:val="false"/>
+                <w:sz w:val="18"/>
+                <w:szCs w:val="18"/>
+              </w:rPr>
+              <w:t xml:space="preserve">0.819</w:t>
+            </w:r>
+          </w:p>
+        </w:tc>
+      </w:tr>
+      <w:tr>
+        <w:trPr>
+          <w:cantSplit/>
+        </w:trPr>
+        <w:tc>
+          <w:tcPr>
+            <w:tcW w:type="dxa" w:w="2700"/>
+            <w:tcBorders>
+              <w:top w:val="none" w:color="FFFFFF" w:sz="0"/>
+              <w:left w:val="none" w:color="FFFFFF" w:sz="0"/>
+              <w:bottom w:val="none" w:color="FFFFFF" w:sz="0"/>
+              <w:right w:val="none" w:color="FFFFFF" w:sz="0"/>
+            </w:tcBorders>
+            <w:tcMar>
+              <w:top w:type="dxa" w:w="35"/>
+              <w:left w:type="dxa" w:w="70"/>
+              <w:bottom w:type="dxa" w:w="35"/>
+              <w:right w:type="dxa" w:w="70"/>
+            </w:tcMar>
+          </w:tcPr>
+          <w:p>
+            <w:pPr>
+              <w:keepNext/>
+              <w:jc w:val="left"/>
+            </w:pPr>
+            <w:r>
+              <w:rPr>
+                <w:rFonts w:ascii="Times New Roman" w:cs="Times New Roman" w:eastAsia="Times New Roman" w:hAnsi="Times New Roman"/>
+                <w:b w:val="false"/>
+                <w:bCs w:val="false"/>
+                <w:sz w:val="18"/>
+                <w:szCs w:val="18"/>
+              </w:rPr>
+              <w:t xml:space="preserve">Ruido leve (σ = 10)</w:t>
+            </w:r>
+          </w:p>
+        </w:tc>
+        <w:tc>
+          <w:tcPr>
+            <w:tcW w:type="dxa" w:w="3330"/>
+            <w:tcBorders>
+              <w:top w:val="none" w:color="FFFFFF" w:sz="0"/>
+              <w:left w:val="none" w:color="FFFFFF" w:sz="0"/>
+              <w:bottom w:val="none" w:color="FFFFFF" w:sz="0"/>
+              <w:right w:val="none" w:color="FFFFFF" w:sz="0"/>
+            </w:tcBorders>
+            <w:tcMar>
+              <w:top w:type="dxa" w:w="35"/>
+              <w:left w:type="dxa" w:w="70"/>
+              <w:bottom w:type="dxa" w:w="35"/>
+              <w:right w:type="dxa" w:w="70"/>
+            </w:tcMar>
+          </w:tcPr>
+          <w:p>
+            <w:pPr>
+              <w:keepNext/>
+              <w:jc w:val="center"/>
+            </w:pPr>
+            <w:r>
+              <w:rPr>
+                <w:rFonts w:ascii="Times New Roman" w:cs="Times New Roman" w:eastAsia="Times New Roman" w:hAnsi="Times New Roman"/>
+                <w:b w:val="false"/>
+                <w:bCs w:val="false"/>
+                <w:sz w:val="18"/>
+                <w:szCs w:val="18"/>
+              </w:rPr>
+              <w:t xml:space="preserve">0.690</w:t>
+            </w:r>
+          </w:p>
+        </w:tc>
+        <w:tc>
+          <w:tcPr>
+            <w:tcW w:type="dxa" w:w="3330"/>
+            <w:tcBorders>
+              <w:top w:val="none" w:color="FFFFFF" w:sz="0"/>
+              <w:left w:val="none" w:color="FFFFFF" w:sz="0"/>
+              <w:bottom w:val="none" w:color="FFFFFF" w:sz="0"/>
+              <w:right w:val="none" w:color="FFFFFF" w:sz="0"/>
+            </w:tcBorders>
+            <w:tcMar>
+              <w:top w:type="dxa" w:w="35"/>
+              <w:left w:type="dxa" w:w="70"/>
+              <w:bottom w:type="dxa" w:w="35"/>
+              <w:right w:type="dxa" w:w="70"/>
+            </w:tcMar>
+          </w:tcPr>
+          <w:p>
+            <w:pPr>
+              <w:keepNext/>
+              <w:jc w:val="center"/>
+            </w:pPr>
+            <w:r>
+              <w:rPr>
+                <w:rFonts w:ascii="Times New Roman" w:cs="Times New Roman" w:eastAsia="Times New Roman" w:hAnsi="Times New Roman"/>
+                <w:b w:val="false"/>
+                <w:bCs w:val="false"/>
+                <w:sz w:val="18"/>
+                <w:szCs w:val="18"/>
+              </w:rPr>
+              <w:t xml:space="preserve">0.654</w:t>
+            </w:r>
+          </w:p>
+        </w:tc>
+      </w:tr>
+      <w:tr>
+        <w:trPr>
+          <w:cantSplit/>
+        </w:trPr>
+        <w:tc>
+          <w:tcPr>
+            <w:tcW w:type="dxa" w:w="2700"/>
+            <w:tcBorders>
+              <w:top w:val="none" w:color="FFFFFF" w:sz="0"/>
+              <w:left w:val="none" w:color="FFFFFF" w:sz="0"/>
+              <w:bottom w:val="none" w:color="FFFFFF" w:sz="0"/>
+              <w:right w:val="none" w:color="FFFFFF" w:sz="0"/>
+            </w:tcBorders>
+            <w:tcMar>
+              <w:top w:type="dxa" w:w="35"/>
+              <w:left w:type="dxa" w:w="70"/>
+              <w:bottom w:type="dxa" w:w="35"/>
+              <w:right w:type="dxa" w:w="70"/>
+            </w:tcMar>
+          </w:tcPr>
+          <w:p>
+            <w:pPr>
+              <w:keepNext/>
+              <w:jc w:val="left"/>
+            </w:pPr>
+            <w:r>
+              <w:rPr>
+                <w:rFonts w:ascii="Times New Roman" w:cs="Times New Roman" w:eastAsia="Times New Roman" w:hAnsi="Times New Roman"/>
+                <w:b w:val="false"/>
+                <w:bCs w:val="false"/>
+                <w:sz w:val="18"/>
+                <w:szCs w:val="18"/>
+              </w:rPr>
+              <w:t xml:space="preserve">Ruido leve y suavizado (σ = 1)</w:t>
+            </w:r>
+          </w:p>
+        </w:tc>
+        <w:tc>
+          <w:tcPr>
+            <w:tcW w:type="dxa" w:w="3330"/>
+            <w:tcBorders>
+              <w:top w:val="none" w:color="FFFFFF" w:sz="0"/>
+              <w:left w:val="none" w:color="FFFFFF" w:sz="0"/>
+              <w:bottom w:val="none" w:color="FFFFFF" w:sz="0"/>
+              <w:right w:val="none" w:color="FFFFFF" w:sz="0"/>
+            </w:tcBorders>
+            <w:tcMar>
+              <w:top w:type="dxa" w:w="35"/>
+              <w:left w:type="dxa" w:w="70"/>
+              <w:bottom w:type="dxa" w:w="35"/>
+              <w:right w:type="dxa" w:w="70"/>
+            </w:tcMar>
+          </w:tcPr>
+          <w:p>
+            <w:pPr>
+              <w:keepNext/>
+              <w:jc w:val="center"/>
+            </w:pPr>
+            <w:r>
+              <w:rPr>
+                <w:rFonts w:ascii="Times New Roman" w:cs="Times New Roman" w:eastAsia="Times New Roman" w:hAnsi="Times New Roman"/>
+                <w:b w:val="false"/>
+                <w:bCs w:val="false"/>
+                <w:sz w:val="18"/>
+                <w:szCs w:val="18"/>
+              </w:rPr>
+              <w:t xml:space="preserve">—</w:t>
+            </w:r>
+          </w:p>
+        </w:tc>
+        <w:tc>
+          <w:tcPr>
+            <w:tcW w:type="dxa" w:w="3330"/>
+            <w:tcBorders>
+              <w:top w:val="none" w:color="FFFFFF" w:sz="0"/>
+              <w:left w:val="none" w:color="FFFFFF" w:sz="0"/>
+              <w:bottom w:val="none" w:color="FFFFFF" w:sz="0"/>
+              <w:right w:val="none" w:color="FFFFFF" w:sz="0"/>
+            </w:tcBorders>
+            <w:tcMar>
+              <w:top w:type="dxa" w:w="35"/>
+              <w:left w:type="dxa" w:w="70"/>
+              <w:bottom w:type="dxa" w:w="35"/>
+              <w:right w:type="dxa" w:w="70"/>
+            </w:tcMar>
+          </w:tcPr>
+          <w:p>
+            <w:pPr>
+              <w:keepNext/>
+              <w:jc w:val="center"/>
+            </w:pPr>
+            <w:r>
+              <w:rPr>
+                <w:rFonts w:ascii="Times New Roman" w:cs="Times New Roman" w:eastAsia="Times New Roman" w:hAnsi="Times New Roman"/>
+                <w:b w:val="false"/>
+                <w:bCs w:val="false"/>
+                <w:sz w:val="18"/>
+                <w:szCs w:val="18"/>
+              </w:rPr>
+              <w:t xml:space="preserve">0.851</w:t>
+            </w:r>
+          </w:p>
+        </w:tc>
+      </w:tr>
+      <w:tr>
+        <w:trPr>
+          <w:cantSplit/>
+        </w:trPr>
+        <w:tc>
+          <w:tcPr>
+            <w:tcW w:type="dxa" w:w="2700"/>
+            <w:tcBorders>
+              <w:top w:val="none" w:color="FFFFFF" w:sz="0"/>
+              <w:left w:val="none" w:color="FFFFFF" w:sz="0"/>
+              <w:bottom w:val="none" w:color="FFFFFF" w:sz="0"/>
+              <w:right w:val="none" w:color="FFFFFF" w:sz="0"/>
+            </w:tcBorders>
+            <w:tcMar>
+              <w:top w:type="dxa" w:w="35"/>
+              <w:left w:type="dxa" w:w="70"/>
+              <w:bottom w:type="dxa" w:w="35"/>
+              <w:right w:type="dxa" w:w="70"/>
+            </w:tcMar>
+          </w:tcPr>
+          <w:p>
+            <w:pPr>
+              <w:keepNext/>
+              <w:jc w:val="left"/>
+            </w:pPr>
+            <w:r>
+              <w:rPr>
+                <w:rFonts w:ascii="Times New Roman" w:cs="Times New Roman" w:eastAsia="Times New Roman" w:hAnsi="Times New Roman"/>
+                <w:b w:val="false"/>
+                <w:bCs w:val="false"/>
+                <w:sz w:val="18"/>
+                <w:szCs w:val="18"/>
+              </w:rPr>
+              <w:t xml:space="preserve">Ruido fuerte (σ = 25)</w:t>
+            </w:r>
+          </w:p>
+        </w:tc>
+        <w:tc>
+          <w:tcPr>
+            <w:tcW w:type="dxa" w:w="3330"/>
+            <w:tcBorders>
+              <w:top w:val="none" w:color="FFFFFF" w:sz="0"/>
+              <w:left w:val="none" w:color="FFFFFF" w:sz="0"/>
+              <w:bottom w:val="none" w:color="FFFFFF" w:sz="0"/>
+              <w:right w:val="none" w:color="FFFFFF" w:sz="0"/>
+            </w:tcBorders>
+            <w:tcMar>
+              <w:top w:type="dxa" w:w="35"/>
+              <w:left w:type="dxa" w:w="70"/>
+              <w:bottom w:type="dxa" w:w="35"/>
+              <w:right w:type="dxa" w:w="70"/>
+            </w:tcMar>
+          </w:tcPr>
+          <w:p>
+            <w:pPr>
+              <w:keepNext/>
+              <w:jc w:val="center"/>
+            </w:pPr>
+            <w:r>
+              <w:rPr>
+                <w:rFonts w:ascii="Times New Roman" w:cs="Times New Roman" w:eastAsia="Times New Roman" w:hAnsi="Times New Roman"/>
+                <w:b w:val="false"/>
+                <w:bCs w:val="false"/>
+                <w:sz w:val="18"/>
+                <w:szCs w:val="18"/>
+              </w:rPr>
+              <w:t xml:space="preserve">0.135</w:t>
+            </w:r>
+          </w:p>
+        </w:tc>
+        <w:tc>
+          <w:tcPr>
+            <w:tcW w:type="dxa" w:w="3330"/>
+            <w:tcBorders>
+              <w:top w:val="none" w:color="FFFFFF" w:sz="0"/>
+              <w:left w:val="none" w:color="FFFFFF" w:sz="0"/>
+              <w:bottom w:val="none" w:color="FFFFFF" w:sz="0"/>
+              <w:right w:val="none" w:color="FFFFFF" w:sz="0"/>
+            </w:tcBorders>
+            <w:tcMar>
+              <w:top w:type="dxa" w:w="35"/>
+              <w:left w:type="dxa" w:w="70"/>
+              <w:bottom w:type="dxa" w:w="35"/>
+              <w:right w:type="dxa" w:w="70"/>
+            </w:tcMar>
+          </w:tcPr>
+          <w:p>
+            <w:pPr>
+              <w:keepNext/>
+              <w:jc w:val="center"/>
+            </w:pPr>
+            <w:r>
+              <w:rPr>
+                <w:rFonts w:ascii="Times New Roman" w:cs="Times New Roman" w:eastAsia="Times New Roman" w:hAnsi="Times New Roman"/>
+                <w:b w:val="false"/>
+                <w:bCs w:val="false"/>
+                <w:sz w:val="18"/>
+                <w:szCs w:val="18"/>
+              </w:rPr>
+              <w:t xml:space="preserve">0.228</w:t>
+            </w:r>
+          </w:p>
+        </w:tc>
+      </w:tr>
+    </w:tbl>
+    <w:p>
+      <w:pPr>
+        <w:spacing w:after="90"/>
+      </w:pPr>
+    </w:p>
+    <w:p>
+      <w:pPr>
+        <w:spacing w:after="95" w:line="250"/>
+        <w:jc w:val="both"/>
+      </w:pPr>
+      <w:r>
+        <w:rPr>
+          <w:rFonts w:ascii="Times New Roman" w:cs="Times New Roman" w:eastAsia="Times New Roman" w:hAnsi="Times New Roman"/>
+          <w:sz w:val="21"/>
+          <w:szCs w:val="21"/>
+        </w:rPr>
+        <w:t xml:space="preserve">El enderezado recupera casi todo el giro de 60° y casi no cuesta con pacientes derechos (0.872 frente a 0.873). El EMA no era la causa de la fragilidad: los dos modelos resisten el desenfoque y la baja resolución, y los dos caen con ruido. Suavizar la imagen antes del modelo recupera el ruido leve sin reentrenar, pero cuesta 0.014 en imágenes limpias, así que se aplica solo cuando la imagen viene ruidosa, con un aviso. Con H7, apagar CBAM al predecir baja el F1 de 0.992 a 0.444 y el mAP50 de 0.974 a 0.401: el modelo depende de CBAM sobre todo en clasificación y detección.</w:t>
+      </w:r>
+    </w:p>
+    <w:p>
+      <w:pPr>
+        <w:keepNext/>
         <w:spacing w:after="90" w:before="200"/>
       </w:pPr>
       <w:r>
@@ -8871,7 +10120,7 @@
           <w:sz w:val="21"/>
           <w:szCs w:val="21"/>
         </w:rPr>
-        <w:t xml:space="preserve">La cabeza de clasificación decide en cada corte si cada región está presente, así que hay una matriz de dos por dos por región (Tabla 9, sobre los 4 664 cortes de test). El error más frecuente es no detectar el sacro: pasa en 56 de los 2 294 cortes en que está.</w:t>
+        <w:t xml:space="preserve">La cabeza de clasificación decide en cada corte si cada región está presente, así que hay una matriz de dos por dos por región (Tabla 10, sobre los 4 664 cortes de test). El error más frecuente es no detectar el sacro: pasa en 56 de los 2 294 cortes en que está.</w:t>
       </w:r>
     </w:p>
     <w:p>
@@ -8886,7 +10135,7 @@
           <w:sz w:val="18"/>
           <w:szCs w:val="18"/>
         </w:rPr>
-        <w:t xml:space="preserve">Tabla 9. Matriz de confusión de la clasificación por región en test (H6, semilla 42).</w:t>
+        <w:t xml:space="preserve">Tabla 10. Matriz de confusión de la clasificación por región en test (H6, semilla 42).</w:t>
       </w:r>
     </w:p>
     <w:tbl>
@@ -10006,7 +11255,7 @@
           <w:sz w:val="21"/>
           <w:szCs w:val="21"/>
         </w:rPr>
-        <w:t xml:space="preserve">A nivel de píxel (Tabla 10), casi todo el error de la máscara semántica es hueso que se predice como fondo, sobre todo en el sacro. La confusión entre coxal izquierdo y derecho, que con D5 llegaba al 13.7 % del hueso en el caso 012, queda por debajo del 0.1 %.</w:t>
+        <w:t xml:space="preserve">A nivel de píxel (Tabla 11), casi todo el error de la máscara semántica es hueso que se predice como fondo, sobre todo en el sacro. La confusión entre coxal izquierdo y derecho, que con D5 llegaba al 13.7 % del hueso en el caso 012, queda por debajo del 0.1 %.</w:t>
       </w:r>
     </w:p>
     <w:p>
@@ -10021,7 +11270,7 @@
           <w:sz w:val="18"/>
           <w:szCs w:val="18"/>
         </w:rPr>
-        <w:t xml:space="preserve">Tabla 10. Matriz de confusión de la segmentación semántica en test, en porcentaje de cada clase real (filas).</w:t>
+        <w:t xml:space="preserve">Tabla 11. Matriz de confusión de la segmentación semántica en test, en porcentaje de cada clase real (filas).</w:t>
       </w:r>
     </w:p>
     <w:tbl>
@@ -10930,7 +12179,7 @@
           <w:sz w:val="21"/>
           <w:szCs w:val="21"/>
         </w:rPr>
-        <w:t xml:space="preserve">La Tabla 11 y la Figura 4 muestran los cinco casos de test con menor Dice por fragmento. En los cinco el fragmento principal se segmenta bien (entre 0.87 y 0.91) y el error está en los secundarios: lo que falta resolver ya no es a qué hueso pertenece cada píxel, sino dónde se parte el hueso en fragmentos.</w:t>
+        <w:t xml:space="preserve">La Tabla 12 y la Figura 4 muestran los cinco casos de test con menor Dice por fragmento. En los cinco el fragmento principal se segmenta bien (entre 0.87 y 0.91) y el error está en los secundarios: lo que falta resolver ya no es a qué hueso pertenece cada píxel, sino dónde se parte el hueso en fragmentos.</w:t>
       </w:r>
     </w:p>
     <w:p>
@@ -10945,7 +12194,7 @@
           <w:sz w:val="18"/>
           <w:szCs w:val="18"/>
         </w:rPr>
-        <w:t xml:space="preserve">Tabla 11. Los cinco peores casos de test con H6 y la causa más probable de cada uno.</w:t>
+        <w:t xml:space="preserve">Tabla 12. Los cinco peores casos de test con H6 y la causa más probable de cada uno.</w:t>
       </w:r>
     </w:p>
     <w:tbl>
@@ -12670,7 +13919,7 @@
           <w:sz w:val="21"/>
           <w:szCs w:val="21"/>
         </w:rPr>
-        <w:t xml:space="preserve">Su Dice es 0.750 en test y el 7.8 % no tiene pareja en la predicción.</w:t>
+        <w:t xml:space="preserve">Su Dice es 0.750 en test (H6) y el 7.8 % no tiene pareja en la predicción.</w:t>
       </w:r>
     </w:p>
     <w:p>
@@ -12786,7 +14035,36 @@
           <w:sz w:val="21"/>
           <w:szCs w:val="21"/>
         </w:rPr>
-        <w:t xml:space="preserve">El modelo depende de la cabecera del archivo. Un volumen sin esa información, o un paciente girado más de lo que cubre el aumento, entra mal orientado.</w:t>
+        <w:t xml:space="preserve">El modelo depende de la cabecera del archivo: la orientación se calcula con productos punto y cruz, pero un volumen oblicuo (inclinado respecto a los ejes) no se probó. El enderezado solo corrige el giro en el plano axial, no el cabeceo ni la inclinación lateral, y falla con un campo de visión corto (caso 044).</w:t>
+      </w:r>
+    </w:p>
+    <w:p>
+      <w:pPr>
+        <w:pStyle w:val="ListParagraph"/>
+        <w:numPr>
+          <w:ilvl w:val="0"/>
+          <w:numId w:val="2"/>
+        </w:numPr>
+        <w:spacing w:after="40" w:line="250"/>
+        <w:jc w:val="both"/>
+      </w:pPr>
+      <w:r>
+        <w:rPr>
+          <w:rFonts w:ascii="Times New Roman" w:cs="Times New Roman" w:eastAsia="Times New Roman" w:hAnsi="Times New Roman"/>
+          <w:b/>
+          <w:bCs/>
+          <w:sz w:val="21"/>
+          <w:szCs w:val="21"/>
+        </w:rPr>
+        <w:t xml:space="preserve">Ruido. </w:t>
+      </w:r>
+      <w:r>
+        <w:rPr>
+          <w:rFonts w:ascii="Times New Roman" w:cs="Times New Roman" w:eastAsia="Times New Roman" w:hAnsi="Times New Roman"/>
+          <w:sz w:val="21"/>
+          <w:szCs w:val="21"/>
+        </w:rPr>
+        <w:t xml:space="preserve">Con ruido leve el Dice por fragmento baja de 0.873 a 0.654; el suavizado lo recupera (0.851), pero con ruido fuerte no llega al objetivo (0.658). La demo debe avisar cuando la imagen viene ruidosa.</w:t>
       </w:r>
     </w:p>
     <w:p>
@@ -12815,7 +14093,7 @@
           <w:sz w:val="21"/>
           <w:szCs w:val="21"/>
         </w:rPr>
-        <w:t xml:space="preserve">Test tiene 15 pacientes de un solo dataset, y la cifra de H6 es una segunda evaluación. No se probó con otros centros ni escáneres.</w:t>
+        <w:t xml:space="preserve">Test tiene 15 pacientes de un solo dataset y se consultó cinco veces: las cifras de H6 y H7 no son estimaciones limpias. No se probó con otros centros ni escáneres.</w:t>
       </w:r>
     </w:p>
     <w:p>
@@ -12874,7 +14152,7 @@
           <w:sz w:val="21"/>
           <w:szCs w:val="21"/>
         </w:rPr>
-        <w:t xml:space="preserve">Una red 2D propia de 2.74 millones de parámetros, sin frameworks de detección ni de segmentación, cumple en test los nueve objetivos del curso. La mejora que cerró la brecha no fue una red más grande: casi todas las variantes de arquitectura, pérdida y post-proceso que probamos quedaron dentro del ruido. Lo que funcionó fue revisar caso por caso por qué fallaba el modelo, encontrar que parte de los datos estaba en otra orientación y corregirlo con una regla fija. El trabajo pendiente está en los fragmentos secundarios en contacto, donde un modelo con contexto 3D debería ayudar.</w:t>
+        <w:t xml:space="preserve">Una red 2D propia de 2.74 millones de parámetros, sin frameworks de detección ni de segmentación, cumple en test los nueve objetivos del curso. La mejora que cerró la brecha no fue una red más grande: casi todas las variantes de arquitectura, pérdida y post-proceso que probamos quedaron dentro del ruido. Lo que funcionó fue revisar caso por caso por qué fallaba el modelo, encontrar que parte de los datos estaba en otra orientación y corregirlo con una regla fija. El trabajo pendiente está en los fragmentos secundarios en contacto, donde un modelo con contexto 3D debería ayudar. Las correcciones del profesor mantuvieron el rendimiento: H7, sin promedio exponencial de los pesos y con la orientación calculada con productos punto y cruz, da 0.879 en test, resiste pacientes girados gracias al enderezado y recupera el ruido leve con un suavizado previo.</w:t>
       </w:r>
     </w:p>
     <w:p>
@@ -12928,15 +14206,7 @@
           <w:sz w:val="19"/>
           <w:szCs w:val="19"/>
         </w:rPr>
-        <w:t xml:space="preserve">[1]  </w:t>
-      </w:r>
-      <w:r>
-        <w:rPr>
-          <w:rFonts w:ascii="Times New Roman" w:cs="Times New Roman" w:eastAsia="Times New Roman" w:hAnsi="Times New Roman"/>
-          <w:sz w:val="19"/>
-          <w:szCs w:val="19"/>
-        </w:rPr>
-        <w:t xml:space="preserve">Y. Sang, Y. Liu, S. Yibulayimu et al., «Benchmark of Segmentation Techniques for Pelvic Fracture in CT and X-Ray: Summary of the PENGWIN 2024 Challenge», IEEE Transactions on Medical Imaging, vol. 45, n.º 5, pp. 2212-2228, 2026. doi:10.1109/TMI.2025.3650126.</w:t>
+        <w:t xml:space="preserve">[1]  Y. Sang, Y. Liu, S. Yibulayimu et al., «Benchmark of Segmentation Techniques for Pelvic Fracture in CT and X-Ray: Summary of the PENGWIN 2024 Challenge», IEEE Transactions on Medical Imaging, vol. 45, n.º 5, pp. 2212-2228, 2026. doi:10.1109/TMI.2025.3650126.</w:t>
       </w:r>
     </w:p>
     <w:p>
@@ -12950,15 +14220,7 @@
           <w:sz w:val="19"/>
           <w:szCs w:val="19"/>
         </w:rPr>
-        <w:t xml:space="preserve">[2]  </w:t>
-      </w:r>
-      <w:r>
-        <w:rPr>
-          <w:rFonts w:ascii="Times New Roman" w:cs="Times New Roman" w:eastAsia="Times New Roman" w:hAnsi="Times New Roman"/>
-          <w:sz w:val="19"/>
-          <w:szCs w:val="19"/>
-        </w:rPr>
-        <w:t xml:space="preserve">Y. Liu, S. Yibulayimu, G. Zhu et al., «Automatic pelvic fracture segmentation: a deep learning approach and benchmark dataset», Frontiers in Medicine, vol. 12, 1511487, 2025.</w:t>
+        <w:t xml:space="preserve">[2]  Y. Liu, S. Yibulayimu, G. Zhu et al., «Automatic pelvic fracture segmentation: a deep learning approach and benchmark dataset», Frontiers in Medicine, vol. 12, 1511487, 2025.</w:t>
       </w:r>
     </w:p>
     <w:p>
@@ -12972,15 +14234,7 @@
           <w:sz w:val="19"/>
           <w:szCs w:val="19"/>
         </w:rPr>
-        <w:t xml:space="preserve">[3]  </w:t>
-      </w:r>
-      <w:r>
-        <w:rPr>
-          <w:rFonts w:ascii="Times New Roman" w:cs="Times New Roman" w:eastAsia="Times New Roman" w:hAnsi="Times New Roman"/>
-          <w:sz w:val="19"/>
-          <w:szCs w:val="19"/>
-        </w:rPr>
-        <w:t xml:space="preserve">Y. Sang, Y. Liu, S. Yibulayimu et al., «PENGWIN Task 1: Pelvic Fracture Segmentation on CT» (conjunto de datos, v1), Zenodo, 2024. doi:10.5281/zenodo.10927452. Licencia CC BY 4.0.</w:t>
+        <w:t xml:space="preserve">[3]  Y. Sang, Y. Liu, S. Yibulayimu et al., «PENGWIN Task 1: Pelvic Fracture Segmentation on CT» (conjunto de datos, v1), Zenodo, 2024. doi:10.5281/zenodo.10927452. Licencia CC BY 4.0.</w:t>
       </w:r>
     </w:p>
     <w:p>
@@ -12994,15 +14248,7 @@
           <w:sz w:val="19"/>
           <w:szCs w:val="19"/>
         </w:rPr>
-        <w:t xml:space="preserve">[4]  </w:t>
-      </w:r>
-      <w:r>
-        <w:rPr>
-          <w:rFonts w:ascii="Times New Roman" w:cs="Times New Roman" w:eastAsia="Times New Roman" w:hAnsi="Times New Roman"/>
-          <w:sz w:val="19"/>
-          <w:szCs w:val="19"/>
-        </w:rPr>
-        <w:t xml:space="preserve">S. Woo, J. Park, J.-Y. Lee e I. S. Kweon, «CBAM: Convolutional Block Attention Module», ECCV, 2018.</w:t>
+        <w:t xml:space="preserve">[4]  S. Woo, J. Park, J.-Y. Lee e I. S. Kweon, «CBAM: Convolutional Block Attention Module», ECCV, 2018.</w:t>
       </w:r>
     </w:p>
     <w:p>
@@ -13016,15 +14262,7 @@
           <w:sz w:val="19"/>
           <w:szCs w:val="19"/>
         </w:rPr>
-        <w:t xml:space="preserve">[5]  </w:t>
-      </w:r>
-      <w:r>
-        <w:rPr>
-          <w:rFonts w:ascii="Times New Roman" w:cs="Times New Roman" w:eastAsia="Times New Roman" w:hAnsi="Times New Roman"/>
-          <w:sz w:val="19"/>
-          <w:szCs w:val="19"/>
-        </w:rPr>
-        <w:t xml:space="preserve">J. Redmon, S. Divvala, R. Girshick y A. Farhadi, «You Only Look Once: Unified, Real-Time Object Detection», CVPR, 2016. Se consultó solo el principio del grid; la implementación es propia.</w:t>
+        <w:t xml:space="preserve">[5]  J. Redmon, S. Divvala, R. Girshick y A. Farhadi, «You Only Look Once: Unified, Real-Time Object Detection», CVPR, 2016. Se consultó solo el principio del grid; la implementación es propia.</w:t>
       </w:r>
     </w:p>
     <w:p>
@@ -13038,15 +14276,21 @@
           <w:sz w:val="19"/>
           <w:szCs w:val="19"/>
         </w:rPr>
-        <w:t xml:space="preserve">[6]  </w:t>
+        <w:t xml:space="preserve">[6]  A. Kirillov, E. Mintun, N. Ravi et al., «Segment Anything», ICCV, 2023.</w:t>
       </w:r>
+    </w:p>
+    <w:p>
+      <w:pPr>
+        <w:spacing w:after="50" w:line="240"/>
+        <w:ind w:left="400" w:hanging="400"/>
+      </w:pPr>
       <w:r>
         <w:rPr>
           <w:rFonts w:ascii="Times New Roman" w:cs="Times New Roman" w:eastAsia="Times New Roman" w:hAnsi="Times New Roman"/>
           <w:sz w:val="19"/>
           <w:szCs w:val="19"/>
         </w:rPr>
-        <w:t xml:space="preserve">A. Kirillov, E. Mintun, N. Ravi et al., «Segment Anything», ICCV, 2023.</w:t>
+        <w:t xml:space="preserve">[7]  C. A. Ferro Sánchez, C. O. Díaz Laverde, S. E. Nope Rodríguez, G. A. Corrales Gallego, J. F. Aristizábal y O. I. Campo Salazar, «Methodology for the correction of a CBCT volume from the skull to the natural head position», MethodsX, vol. 13, 103073, 2024. doi:10.1016/j.mex.2024.103073.</w:t>
       </w:r>
     </w:p>
     <w:sectPr>

</xml_diff>